<commit_message>
[research/gitnexus] Buoc 3.1: Viet bang de xuat cai tien KZTEK (Mode A)
- Them muc 7 vao RESEARCH-gitnexus-2026-08-04.md: 6 de xuat GX-1..GX-6
  GX-1: Depth-grouped impact taxonomy trong §15.3 PR checklist
  GX-2: Field deps tuong minh trong PLAN-STEP frontmatter + validation
  GX-3: Skill /detect-impact (semi-automate PR impact section)
  GX-4: Last verified date trong CODE-GRAPH de flag stale entries
  GX-5: Project-context skill hints tu sinh khi Phase 0 Audit
  GX-6: Structured Handoff Payload keys (do_not_redo/watch_out/next_inputs)
- Xuat lai DOCX thanh cong (PDF that bai do Word.Application.Quit - khong block)
- Cap nhat STEP-3.1-mode-action.md: status done, Handoff Payload day du
- Cap nhat PLAN-MASTER.md: buoc 2.3+3.1 Done, lich su cap nhat

Plan: docs/plans/PLAN-research-gitnexus-2026-08-04/steps/STEP-3.1-mode-action.md

Co-Authored-By: Claude Sonnet 5 <noreply@anthropic.com>
</commit_message>
<xml_diff>
--- a/docs/research/RESEARCH-gitnexus-2026-08-04.docx
+++ b/docs/research/RESEARCH-gitnexus-2026-08-04.docx
@@ -4721,6 +4721,27 @@
     </w:p>
     <w:p>
       <w:pPr>
+        <w:pBdr>
+          <w:bottom w:val="single" w:sz="6" w:space="1" w:color="F05922"/>
+        </w:pBdr>
+        <w:spacing w:after="120"/>
+      </w:pPr>
+    </w:p>
+    <w:p>
+      <w:pPr>
+        <w:pStyle w:val="Heading2"/>
+        <w:spacing w:before="200" w:after="80"/>
+      </w:pPr>
+      <w:r>
+        <w:rPr>
+          <w:color w:val="F05922"/>
+          <w:sz w:val="28"/>
+        </w:rPr>
+        <w:t>7. Bảng đề xuất cải tiến KZTEK (Mode A — Bước 3b)</w:t>
+      </w:r>
+    </w:p>
+    <w:p>
+      <w:pPr>
         <w:spacing w:before="40" w:after="40"/>
         <w:ind w:left="567"/>
         <w:pBdr>
@@ -4732,13 +4753,3221 @@
           <w:b/>
           <w:color w:val="4A3F8C"/>
         </w:rPr>
-        <w:t>Ghi chú bước tiếp theo:</w:t>
+        <w:t>Lưu ý license:</w:t>
       </w:r>
       <w:r>
         <w:rPr>
           <w:color w:val="4A3F8C"/>
         </w:rPr>
-        <w:t xml:space="preserve"> Tài liệu này là phần phân tích trung lập — chưa kèm đề xuất áp dụng. Bước tiếp theo (Mode A: đề xuất cải tiến KZTEK / Mode B: giải thích tương tác) phụ thuộc vào lựa chọn của user.</w:t>
+        <w:t xml:space="preserve"> GitNexus dùng PolyForm Noncommercial — mọi đề xuất dưới đây học từ </w:t>
+      </w:r>
+      <w:r>
+        <w:rPr>
+          <w:b/>
+          <w:color w:val="4A3F8C"/>
+        </w:rPr>
+        <w:t>ý tưởng/pattern</w:t>
+      </w:r>
+      <w:r>
+        <w:rPr>
+          <w:color w:val="4A3F8C"/>
+        </w:rPr>
+        <w:t>, không copy code nguồn. Mỗi cải tiến phải được viết lại từ đầu theo quy ước KZTEK.</w:t>
+      </w:r>
+    </w:p>
+    <w:p>
+      <w:pPr>
+        <w:pStyle w:val="Heading3"/>
+        <w:spacing w:before="160" w:after="60"/>
+      </w:pPr>
+      <w:r>
+        <w:rPr>
+          <w:color w:val="4A3F8C"/>
+          <w:sz w:val="24"/>
+        </w:rPr>
+        <w:t>Tổng hợp đề xuất</w:t>
+      </w:r>
+    </w:p>
+    <w:tbl>
+      <w:tblPr>
+        <w:tblStyle w:val="TableGrid"/>
+        <w:tblW w:type="auto" w:w="0"/>
+        <w:tblLook w:firstColumn="1" w:firstRow="1" w:lastColumn="0" w:lastRow="0" w:noHBand="0" w:noVBand="1" w:val="04A0"/>
+      </w:tblPr>
+      <w:tblGrid>
+        <w:gridCol w:w="1211"/>
+        <w:gridCol w:w="1211"/>
+        <w:gridCol w:w="1211"/>
+        <w:gridCol w:w="1211"/>
+        <w:gridCol w:w="1211"/>
+        <w:gridCol w:w="1211"/>
+        <w:gridCol w:w="1211"/>
+        <w:gridCol w:w="1211"/>
+      </w:tblGrid>
+      <w:tr>
+        <w:tc>
+          <w:tcPr>
+            <w:tcW w:type="dxa" w:w="1211"/>
+            <w:shd w:val="clear" w:color="auto" w:fill="251C53"/>
+            <w:tcBorders>
+              <w:top w:val="single" w:sz="4" w:space="0" w:color="251C53"/>
+              <w:left w:val="single" w:sz="4" w:space="0" w:color="251C53"/>
+              <w:bottom w:val="single" w:sz="4" w:space="0" w:color="251C53"/>
+              <w:right w:val="single" w:sz="4" w:space="0" w:color="251C53"/>
+            </w:tcBorders>
+          </w:tcPr>
+          <w:p>
+            <w:r>
+              <w:rPr>
+                <w:b/>
+                <w:color w:val="FFFFFF"/>
+                <w:sz w:val="20"/>
+              </w:rPr>
+              <w:t>#</w:t>
+            </w:r>
+          </w:p>
+        </w:tc>
+        <w:tc>
+          <w:tcPr>
+            <w:tcW w:type="dxa" w:w="1211"/>
+            <w:shd w:val="clear" w:color="auto" w:fill="251C53"/>
+            <w:tcBorders>
+              <w:top w:val="single" w:sz="4" w:space="0" w:color="251C53"/>
+              <w:left w:val="single" w:sz="4" w:space="0" w:color="251C53"/>
+              <w:bottom w:val="single" w:sz="4" w:space="0" w:color="251C53"/>
+              <w:right w:val="single" w:sz="4" w:space="0" w:color="251C53"/>
+            </w:tcBorders>
+          </w:tcPr>
+          <w:p>
+            <w:r>
+              <w:rPr>
+                <w:b/>
+                <w:color w:val="FFFFFF"/>
+                <w:sz w:val="20"/>
+              </w:rPr>
+              <w:t>Đề xuất</w:t>
+            </w:r>
+          </w:p>
+        </w:tc>
+        <w:tc>
+          <w:tcPr>
+            <w:tcW w:type="dxa" w:w="1211"/>
+            <w:shd w:val="clear" w:color="auto" w:fill="251C53"/>
+            <w:tcBorders>
+              <w:top w:val="single" w:sz="4" w:space="0" w:color="251C53"/>
+              <w:left w:val="single" w:sz="4" w:space="0" w:color="251C53"/>
+              <w:bottom w:val="single" w:sz="4" w:space="0" w:color="251C53"/>
+              <w:right w:val="single" w:sz="4" w:space="0" w:color="251C53"/>
+            </w:tcBorders>
+          </w:tcPr>
+          <w:p>
+            <w:r>
+              <w:rPr>
+                <w:b/>
+                <w:color w:val="FFFFFF"/>
+                <w:sz w:val="20"/>
+              </w:rPr>
+              <w:t>Hiện trạng KZTEK</w:t>
+            </w:r>
+          </w:p>
+        </w:tc>
+        <w:tc>
+          <w:tcPr>
+            <w:tcW w:type="dxa" w:w="1211"/>
+            <w:shd w:val="clear" w:color="auto" w:fill="251C53"/>
+            <w:tcBorders>
+              <w:top w:val="single" w:sz="4" w:space="0" w:color="251C53"/>
+              <w:left w:val="single" w:sz="4" w:space="0" w:color="251C53"/>
+              <w:bottom w:val="single" w:sz="4" w:space="0" w:color="251C53"/>
+              <w:right w:val="single" w:sz="4" w:space="0" w:color="251C53"/>
+            </w:tcBorders>
+          </w:tcPr>
+          <w:p>
+            <w:r>
+              <w:rPr>
+                <w:b/>
+                <w:color w:val="FFFFFF"/>
+                <w:sz w:val="20"/>
+              </w:rPr>
+              <w:t>Học từ đâu trong GitNexus</w:t>
+            </w:r>
+          </w:p>
+        </w:tc>
+        <w:tc>
+          <w:tcPr>
+            <w:tcW w:type="dxa" w:w="1211"/>
+            <w:shd w:val="clear" w:color="auto" w:fill="251C53"/>
+            <w:tcBorders>
+              <w:top w:val="single" w:sz="4" w:space="0" w:color="251C53"/>
+              <w:left w:val="single" w:sz="4" w:space="0" w:color="251C53"/>
+              <w:bottom w:val="single" w:sz="4" w:space="0" w:color="251C53"/>
+              <w:right w:val="single" w:sz="4" w:space="0" w:color="251C53"/>
+            </w:tcBorders>
+          </w:tcPr>
+          <w:p>
+            <w:r>
+              <w:rPr>
+                <w:b/>
+                <w:color w:val="FFFFFF"/>
+                <w:sz w:val="20"/>
+              </w:rPr>
+              <w:t>Lý do thay đổi</w:t>
+            </w:r>
+          </w:p>
+        </w:tc>
+        <w:tc>
+          <w:tcPr>
+            <w:tcW w:type="dxa" w:w="1211"/>
+            <w:shd w:val="clear" w:color="auto" w:fill="251C53"/>
+            <w:tcBorders>
+              <w:top w:val="single" w:sz="4" w:space="0" w:color="251C53"/>
+              <w:left w:val="single" w:sz="4" w:space="0" w:color="251C53"/>
+              <w:bottom w:val="single" w:sz="4" w:space="0" w:color="251C53"/>
+              <w:right w:val="single" w:sz="4" w:space="0" w:color="251C53"/>
+            </w:tcBorders>
+          </w:tcPr>
+          <w:p>
+            <w:r>
+              <w:rPr>
+                <w:b/>
+                <w:color w:val="FFFFFF"/>
+                <w:sz w:val="20"/>
+              </w:rPr>
+              <w:t>Áp dụng vào đâu trong KZTEK</w:t>
+            </w:r>
+          </w:p>
+        </w:tc>
+        <w:tc>
+          <w:tcPr>
+            <w:tcW w:type="dxa" w:w="1211"/>
+            <w:shd w:val="clear" w:color="auto" w:fill="251C53"/>
+            <w:tcBorders>
+              <w:top w:val="single" w:sz="4" w:space="0" w:color="251C53"/>
+              <w:left w:val="single" w:sz="4" w:space="0" w:color="251C53"/>
+              <w:bottom w:val="single" w:sz="4" w:space="0" w:color="251C53"/>
+              <w:right w:val="single" w:sz="4" w:space="0" w:color="251C53"/>
+            </w:tcBorders>
+          </w:tcPr>
+          <w:p>
+            <w:r>
+              <w:rPr>
+                <w:b/>
+                <w:color w:val="FFFFFF"/>
+                <w:sz w:val="20"/>
+              </w:rPr>
+              <w:t>Đạt được gì</w:t>
+            </w:r>
+          </w:p>
+        </w:tc>
+        <w:tc>
+          <w:tcPr>
+            <w:tcW w:type="dxa" w:w="1211"/>
+            <w:shd w:val="clear" w:color="auto" w:fill="251C53"/>
+            <w:tcBorders>
+              <w:top w:val="single" w:sz="4" w:space="0" w:color="251C53"/>
+              <w:left w:val="single" w:sz="4" w:space="0" w:color="251C53"/>
+              <w:bottom w:val="single" w:sz="4" w:space="0" w:color="251C53"/>
+              <w:right w:val="single" w:sz="4" w:space="0" w:color="251C53"/>
+            </w:tcBorders>
+          </w:tcPr>
+          <w:p>
+            <w:r>
+              <w:rPr>
+                <w:b/>
+                <w:color w:val="FFFFFF"/>
+                <w:sz w:val="20"/>
+              </w:rPr>
+              <w:t>Rủi ro / Effort</w:t>
+            </w:r>
+          </w:p>
+        </w:tc>
+      </w:tr>
+      <w:tr>
+        <w:tc>
+          <w:tcPr>
+            <w:tcW w:type="dxa" w:w="1211"/>
+            <w:tcBorders>
+              <w:top w:val="single" w:sz="4" w:space="0" w:color="CBCBCB"/>
+              <w:left w:val="single" w:sz="4" w:space="0" w:color="CBCBCB"/>
+              <w:bottom w:val="single" w:sz="4" w:space="0" w:color="CBCBCB"/>
+              <w:right w:val="single" w:sz="4" w:space="0" w:color="CBCBCB"/>
+            </w:tcBorders>
+          </w:tcPr>
+          <w:p>
+            <w:r>
+              <w:rPr>
+                <w:sz w:val="20"/>
+              </w:rPr>
+              <w:t>---</w:t>
+            </w:r>
+          </w:p>
+        </w:tc>
+        <w:tc>
+          <w:tcPr>
+            <w:tcW w:type="dxa" w:w="1211"/>
+            <w:tcBorders>
+              <w:top w:val="single" w:sz="4" w:space="0" w:color="CBCBCB"/>
+              <w:left w:val="single" w:sz="4" w:space="0" w:color="CBCBCB"/>
+              <w:bottom w:val="single" w:sz="4" w:space="0" w:color="CBCBCB"/>
+              <w:right w:val="single" w:sz="4" w:space="0" w:color="CBCBCB"/>
+            </w:tcBorders>
+          </w:tcPr>
+          <w:p>
+            <w:r>
+              <w:rPr>
+                <w:sz w:val="20"/>
+              </w:rPr>
+              <w:t>---------</w:t>
+            </w:r>
+          </w:p>
+        </w:tc>
+        <w:tc>
+          <w:tcPr>
+            <w:tcW w:type="dxa" w:w="1211"/>
+            <w:tcBorders>
+              <w:top w:val="single" w:sz="4" w:space="0" w:color="CBCBCB"/>
+              <w:left w:val="single" w:sz="4" w:space="0" w:color="CBCBCB"/>
+              <w:bottom w:val="single" w:sz="4" w:space="0" w:color="CBCBCB"/>
+              <w:right w:val="single" w:sz="4" w:space="0" w:color="CBCBCB"/>
+            </w:tcBorders>
+          </w:tcPr>
+          <w:p>
+            <w:r>
+              <w:rPr>
+                <w:sz w:val="20"/>
+              </w:rPr>
+              <w:t>-----------------</w:t>
+            </w:r>
+          </w:p>
+        </w:tc>
+        <w:tc>
+          <w:tcPr>
+            <w:tcW w:type="dxa" w:w="1211"/>
+            <w:tcBorders>
+              <w:top w:val="single" w:sz="4" w:space="0" w:color="CBCBCB"/>
+              <w:left w:val="single" w:sz="4" w:space="0" w:color="CBCBCB"/>
+              <w:bottom w:val="single" w:sz="4" w:space="0" w:color="CBCBCB"/>
+              <w:right w:val="single" w:sz="4" w:space="0" w:color="CBCBCB"/>
+            </w:tcBorders>
+          </w:tcPr>
+          <w:p>
+            <w:r>
+              <w:rPr>
+                <w:sz w:val="20"/>
+              </w:rPr>
+              <w:t>--------------------------</w:t>
+            </w:r>
+          </w:p>
+        </w:tc>
+        <w:tc>
+          <w:tcPr>
+            <w:tcW w:type="dxa" w:w="1211"/>
+            <w:tcBorders>
+              <w:top w:val="single" w:sz="4" w:space="0" w:color="CBCBCB"/>
+              <w:left w:val="single" w:sz="4" w:space="0" w:color="CBCBCB"/>
+              <w:bottom w:val="single" w:sz="4" w:space="0" w:color="CBCBCB"/>
+              <w:right w:val="single" w:sz="4" w:space="0" w:color="CBCBCB"/>
+            </w:tcBorders>
+          </w:tcPr>
+          <w:p>
+            <w:r>
+              <w:rPr>
+                <w:sz w:val="20"/>
+              </w:rPr>
+              <w:t>----------------</w:t>
+            </w:r>
+          </w:p>
+        </w:tc>
+        <w:tc>
+          <w:tcPr>
+            <w:tcW w:type="dxa" w:w="1211"/>
+            <w:tcBorders>
+              <w:top w:val="single" w:sz="4" w:space="0" w:color="CBCBCB"/>
+              <w:left w:val="single" w:sz="4" w:space="0" w:color="CBCBCB"/>
+              <w:bottom w:val="single" w:sz="4" w:space="0" w:color="CBCBCB"/>
+              <w:right w:val="single" w:sz="4" w:space="0" w:color="CBCBCB"/>
+            </w:tcBorders>
+          </w:tcPr>
+          <w:p>
+            <w:r>
+              <w:rPr>
+                <w:sz w:val="20"/>
+              </w:rPr>
+              <w:t>------------------------------</w:t>
+            </w:r>
+          </w:p>
+        </w:tc>
+        <w:tc>
+          <w:tcPr>
+            <w:tcW w:type="dxa" w:w="1211"/>
+            <w:tcBorders>
+              <w:top w:val="single" w:sz="4" w:space="0" w:color="CBCBCB"/>
+              <w:left w:val="single" w:sz="4" w:space="0" w:color="CBCBCB"/>
+              <w:bottom w:val="single" w:sz="4" w:space="0" w:color="CBCBCB"/>
+              <w:right w:val="single" w:sz="4" w:space="0" w:color="CBCBCB"/>
+            </w:tcBorders>
+          </w:tcPr>
+          <w:p>
+            <w:r>
+              <w:rPr>
+                <w:sz w:val="20"/>
+              </w:rPr>
+              <w:t>-------------</w:t>
+            </w:r>
+          </w:p>
+        </w:tc>
+        <w:tc>
+          <w:tcPr>
+            <w:tcW w:type="dxa" w:w="1211"/>
+            <w:tcBorders>
+              <w:top w:val="single" w:sz="4" w:space="0" w:color="CBCBCB"/>
+              <w:left w:val="single" w:sz="4" w:space="0" w:color="CBCBCB"/>
+              <w:bottom w:val="single" w:sz="4" w:space="0" w:color="CBCBCB"/>
+              <w:right w:val="single" w:sz="4" w:space="0" w:color="CBCBCB"/>
+            </w:tcBorders>
+          </w:tcPr>
+          <w:p>
+            <w:r>
+              <w:rPr>
+                <w:sz w:val="20"/>
+              </w:rPr>
+              <w:t>-----------------</w:t>
+            </w:r>
+          </w:p>
+        </w:tc>
+      </w:tr>
+      <w:tr>
+        <w:tc>
+          <w:tcPr>
+            <w:tcW w:type="dxa" w:w="1211"/>
+            <w:shd w:val="clear" w:color="auto" w:fill="B8B3D6"/>
+            <w:tcBorders>
+              <w:top w:val="single" w:sz="4" w:space="0" w:color="CBCBCB"/>
+              <w:left w:val="single" w:sz="4" w:space="0" w:color="CBCBCB"/>
+              <w:bottom w:val="single" w:sz="4" w:space="0" w:color="CBCBCB"/>
+              <w:right w:val="single" w:sz="4" w:space="0" w:color="CBCBCB"/>
+            </w:tcBorders>
+          </w:tcPr>
+          <w:p>
+            <w:r>
+              <w:rPr>
+                <w:sz w:val="20"/>
+              </w:rPr>
+              <w:t>GX-1</w:t>
+            </w:r>
+          </w:p>
+        </w:tc>
+        <w:tc>
+          <w:tcPr>
+            <w:tcW w:type="dxa" w:w="1211"/>
+            <w:shd w:val="clear" w:color="auto" w:fill="B8B3D6"/>
+            <w:tcBorders>
+              <w:top w:val="single" w:sz="4" w:space="0" w:color="CBCBCB"/>
+              <w:left w:val="single" w:sz="4" w:space="0" w:color="CBCBCB"/>
+              <w:bottom w:val="single" w:sz="4" w:space="0" w:color="CBCBCB"/>
+              <w:right w:val="single" w:sz="4" w:space="0" w:color="CBCBCB"/>
+            </w:tcBorders>
+          </w:tcPr>
+          <w:p>
+            <w:r>
+              <w:rPr>
+                <w:sz w:val="20"/>
+              </w:rPr>
+              <w:t>Depth-grouped impact taxonomy trong PR checklist</w:t>
+            </w:r>
+          </w:p>
+        </w:tc>
+        <w:tc>
+          <w:tcPr>
+            <w:tcW w:type="dxa" w:w="1211"/>
+            <w:shd w:val="clear" w:color="auto" w:fill="B8B3D6"/>
+            <w:tcBorders>
+              <w:top w:val="single" w:sz="4" w:space="0" w:color="CBCBCB"/>
+              <w:left w:val="single" w:sz="4" w:space="0" w:color="CBCBCB"/>
+              <w:bottom w:val="single" w:sz="4" w:space="0" w:color="CBCBCB"/>
+              <w:right w:val="single" w:sz="4" w:space="0" w:color="CBCBCB"/>
+            </w:tcBorders>
+          </w:tcPr>
+          <w:p>
+            <w:r>
+              <w:rPr>
+                <w:sz w:val="20"/>
+              </w:rPr>
+              <w:t>§15.3: cột "CODE-GRAPH impact" là free-text "liệt kê module/node... hoặc Không có" — agent tự suy luận, không có cấu trúc depth</w:t>
+            </w:r>
+          </w:p>
+        </w:tc>
+        <w:tc>
+          <w:tcPr>
+            <w:tcW w:type="dxa" w:w="1211"/>
+            <w:shd w:val="clear" w:color="auto" w:fill="B8B3D6"/>
+            <w:tcBorders>
+              <w:top w:val="single" w:sz="4" w:space="0" w:color="CBCBCB"/>
+              <w:left w:val="single" w:sz="4" w:space="0" w:color="CBCBCB"/>
+              <w:bottom w:val="single" w:sz="4" w:space="0" w:color="CBCBCB"/>
+              <w:right w:val="single" w:sz="4" w:space="0" w:color="CBCBCB"/>
+            </w:tcBorders>
+          </w:tcPr>
+          <w:p>
+            <w:r>
+              <w:rPr>
+                <w:rFonts w:ascii="Courier New" w:hAnsi="Courier New"/>
+                <w:color w:val="F05922"/>
+                <w:sz w:val="20"/>
+              </w:rPr>
+              <w:t>impact</w:t>
+            </w:r>
+            <w:r>
+              <w:rPr>
+                <w:sz w:val="20"/>
+              </w:rPr>
+              <w:t xml:space="preserve"> MCP tool (3.4): trả về blast radius theo depth — d=1 "WILL BREAK" (caller trực tiếp), d=2 "LIKELY AFFECTED" (caller của caller) kèm confidence</w:t>
+            </w:r>
+          </w:p>
+        </w:tc>
+        <w:tc>
+          <w:tcPr>
+            <w:tcW w:type="dxa" w:w="1211"/>
+            <w:shd w:val="clear" w:color="auto" w:fill="B8B3D6"/>
+            <w:tcBorders>
+              <w:top w:val="single" w:sz="4" w:space="0" w:color="CBCBCB"/>
+              <w:left w:val="single" w:sz="4" w:space="0" w:color="CBCBCB"/>
+              <w:bottom w:val="single" w:sz="4" w:space="0" w:color="CBCBCB"/>
+              <w:right w:val="single" w:sz="4" w:space="0" w:color="CBCBCB"/>
+            </w:tcBorders>
+          </w:tcPr>
+          <w:p>
+            <w:r>
+              <w:rPr>
+                <w:sz w:val="20"/>
+              </w:rPr>
+              <w:t>Hiện tại agent viết tự do → reviewer không biết "Không có" là thật hay vì agent bỏ sót; không có sự phân biệt caller trực tiếp vs gián tiếp → review nông</w:t>
+            </w:r>
+          </w:p>
+        </w:tc>
+        <w:tc>
+          <w:tcPr>
+            <w:tcW w:type="dxa" w:w="1211"/>
+            <w:shd w:val="clear" w:color="auto" w:fill="B8B3D6"/>
+            <w:tcBorders>
+              <w:top w:val="single" w:sz="4" w:space="0" w:color="CBCBCB"/>
+              <w:left w:val="single" w:sz="4" w:space="0" w:color="CBCBCB"/>
+              <w:bottom w:val="single" w:sz="4" w:space="0" w:color="CBCBCB"/>
+              <w:right w:val="single" w:sz="4" w:space="0" w:color="CBCBCB"/>
+            </w:tcBorders>
+          </w:tcPr>
+          <w:p>
+            <w:r>
+              <w:rPr>
+                <w:sz w:val="20"/>
+              </w:rPr>
+              <w:t xml:space="preserve">§15.3 CLAUDE.md (sửa hướng dẫn + format mẫu); CODE-GRAPH-template.md (thêm cột </w:t>
+            </w:r>
+            <w:r>
+              <w:rPr>
+                <w:rFonts w:ascii="Courier New" w:hAnsi="Courier New"/>
+                <w:color w:val="F05922"/>
+                <w:sz w:val="20"/>
+              </w:rPr>
+              <w:t>Callers/Used-by</w:t>
+            </w:r>
+            <w:r>
+              <w:rPr>
+                <w:sz w:val="20"/>
+              </w:rPr>
+              <w:t>)</w:t>
+            </w:r>
+          </w:p>
+        </w:tc>
+        <w:tc>
+          <w:tcPr>
+            <w:tcW w:type="dxa" w:w="1211"/>
+            <w:shd w:val="clear" w:color="auto" w:fill="B8B3D6"/>
+            <w:tcBorders>
+              <w:top w:val="single" w:sz="4" w:space="0" w:color="CBCBCB"/>
+              <w:left w:val="single" w:sz="4" w:space="0" w:color="CBCBCB"/>
+              <w:bottom w:val="single" w:sz="4" w:space="0" w:color="CBCBCB"/>
+              <w:right w:val="single" w:sz="4" w:space="0" w:color="CBCBCB"/>
+            </w:tcBorders>
+          </w:tcPr>
+          <w:p>
+            <w:r>
+              <w:rPr>
+                <w:sz w:val="20"/>
+              </w:rPr>
+              <w:t>PR checklist impact có cấu trúc 2-depth: depth-1 liệt kê module WILL BREAK (có thể đếm), depth-2 liệt kê LIKELY AFFECTED; reviewer có thể scan nhanh rủi ro mà không cần tự trace CODE-GRAPH</w:t>
+            </w:r>
+          </w:p>
+        </w:tc>
+        <w:tc>
+          <w:tcPr>
+            <w:tcW w:type="dxa" w:w="1211"/>
+            <w:shd w:val="clear" w:color="auto" w:fill="B8B3D6"/>
+            <w:tcBorders>
+              <w:top w:val="single" w:sz="4" w:space="0" w:color="CBCBCB"/>
+              <w:left w:val="single" w:sz="4" w:space="0" w:color="CBCBCB"/>
+              <w:bottom w:val="single" w:sz="4" w:space="0" w:color="CBCBCB"/>
+              <w:right w:val="single" w:sz="4" w:space="0" w:color="CBCBCB"/>
+            </w:tcBorders>
+          </w:tcPr>
+          <w:p>
+            <w:r>
+              <w:rPr>
+                <w:sz w:val="20"/>
+              </w:rPr>
+              <w:t>Thấp — chỉ sửa text trong 2 file template; không đổi code</w:t>
+            </w:r>
+          </w:p>
+        </w:tc>
+      </w:tr>
+      <w:tr>
+        <w:tc>
+          <w:tcPr>
+            <w:tcW w:type="dxa" w:w="1211"/>
+            <w:tcBorders>
+              <w:top w:val="single" w:sz="4" w:space="0" w:color="CBCBCB"/>
+              <w:left w:val="single" w:sz="4" w:space="0" w:color="CBCBCB"/>
+              <w:bottom w:val="single" w:sz="4" w:space="0" w:color="CBCBCB"/>
+              <w:right w:val="single" w:sz="4" w:space="0" w:color="CBCBCB"/>
+            </w:tcBorders>
+          </w:tcPr>
+          <w:p>
+            <w:r>
+              <w:rPr>
+                <w:sz w:val="20"/>
+              </w:rPr>
+              <w:t>GX-2</w:t>
+            </w:r>
+          </w:p>
+        </w:tc>
+        <w:tc>
+          <w:tcPr>
+            <w:tcW w:type="dxa" w:w="1211"/>
+            <w:tcBorders>
+              <w:top w:val="single" w:sz="4" w:space="0" w:color="CBCBCB"/>
+              <w:left w:val="single" w:sz="4" w:space="0" w:color="CBCBCB"/>
+              <w:bottom w:val="single" w:sz="4" w:space="0" w:color="CBCBCB"/>
+              <w:right w:val="single" w:sz="4" w:space="0" w:color="CBCBCB"/>
+            </w:tcBorders>
+          </w:tcPr>
+          <w:p>
+            <w:r>
+              <w:rPr>
+                <w:sz w:val="20"/>
+              </w:rPr>
+              <w:t xml:space="preserve">Field </w:t>
+            </w:r>
+            <w:r>
+              <w:rPr>
+                <w:rFonts w:ascii="Courier New" w:hAnsi="Courier New"/>
+                <w:color w:val="F05922"/>
+                <w:sz w:val="20"/>
+              </w:rPr>
+              <w:t>deps</w:t>
+            </w:r>
+            <w:r>
+              <w:rPr>
+                <w:sz w:val="20"/>
+              </w:rPr>
+              <w:t xml:space="preserve"> tường minh trong PLAN-STEP frontmatter + validation bởi task-planner</w:t>
+            </w:r>
+          </w:p>
+        </w:tc>
+        <w:tc>
+          <w:tcPr>
+            <w:tcW w:type="dxa" w:w="1211"/>
+            <w:tcBorders>
+              <w:top w:val="single" w:sz="4" w:space="0" w:color="CBCBCB"/>
+              <w:left w:val="single" w:sz="4" w:space="0" w:color="CBCBCB"/>
+              <w:bottom w:val="single" w:sz="4" w:space="0" w:color="CBCBCB"/>
+              <w:right w:val="single" w:sz="4" w:space="0" w:color="CBCBCB"/>
+            </w:tcBorders>
+          </w:tcPr>
+          <w:p>
+            <w:r>
+              <w:rPr>
+                <w:sz w:val="20"/>
+              </w:rPr>
+              <w:t xml:space="preserve">PLAN-STEP-template.md: frontmatter chỉ có </w:t>
+            </w:r>
+            <w:r>
+              <w:rPr>
+                <w:rFonts w:ascii="Courier New" w:hAnsi="Courier New"/>
+                <w:color w:val="F05922"/>
+                <w:sz w:val="20"/>
+              </w:rPr>
+              <w:t>step</w:t>
+            </w:r>
+            <w:r>
+              <w:rPr>
+                <w:sz w:val="20"/>
+              </w:rPr>
+              <w:t xml:space="preserve">, </w:t>
+            </w:r>
+            <w:r>
+              <w:rPr>
+                <w:rFonts w:ascii="Courier New" w:hAnsi="Courier New"/>
+                <w:color w:val="F05922"/>
+                <w:sz w:val="20"/>
+              </w:rPr>
+              <w:t>plan</w:t>
+            </w:r>
+            <w:r>
+              <w:rPr>
+                <w:sz w:val="20"/>
+              </w:rPr>
+              <w:t xml:space="preserve">, </w:t>
+            </w:r>
+            <w:r>
+              <w:rPr>
+                <w:rFonts w:ascii="Courier New" w:hAnsi="Courier New"/>
+                <w:color w:val="F05922"/>
+                <w:sz w:val="20"/>
+              </w:rPr>
+              <w:t>agent</w:t>
+            </w:r>
+            <w:r>
+              <w:rPr>
+                <w:sz w:val="20"/>
+              </w:rPr>
+              <w:t xml:space="preserve">, </w:t>
+            </w:r>
+            <w:r>
+              <w:rPr>
+                <w:rFonts w:ascii="Courier New" w:hAnsi="Courier New"/>
+                <w:color w:val="F05922"/>
+                <w:sz w:val="20"/>
+              </w:rPr>
+              <w:t>status</w:t>
+            </w:r>
+            <w:r>
+              <w:rPr>
+                <w:sz w:val="20"/>
+              </w:rPr>
+              <w:t xml:space="preserve">, </w:t>
+            </w:r>
+            <w:r>
+              <w:rPr>
+                <w:rFonts w:ascii="Courier New" w:hAnsi="Courier New"/>
+                <w:color w:val="F05922"/>
+                <w:sz w:val="20"/>
+              </w:rPr>
+              <w:t>completed_at</w:t>
+            </w:r>
+            <w:r>
+              <w:rPr>
+                <w:sz w:val="20"/>
+              </w:rPr>
+              <w:t xml:space="preserve"> — không có </w:t>
+            </w:r>
+            <w:r>
+              <w:rPr>
+                <w:rFonts w:ascii="Courier New" w:hAnsi="Courier New"/>
+                <w:color w:val="F05922"/>
+                <w:sz w:val="20"/>
+              </w:rPr>
+              <w:t>deps</w:t>
+            </w:r>
+            <w:r>
+              <w:rPr>
+                <w:sz w:val="20"/>
+              </w:rPr>
+              <w:t>; "Phụ thuộc" nằm trong body text, task-planner không validate</w:t>
+            </w:r>
+          </w:p>
+        </w:tc>
+        <w:tc>
+          <w:tcPr>
+            <w:tcW w:type="dxa" w:w="1211"/>
+            <w:tcBorders>
+              <w:top w:val="single" w:sz="4" w:space="0" w:color="CBCBCB"/>
+              <w:left w:val="single" w:sz="4" w:space="0" w:color="CBCBCB"/>
+              <w:bottom w:val="single" w:sz="4" w:space="0" w:color="CBCBCB"/>
+              <w:right w:val="single" w:sz="4" w:space="0" w:color="CBCBCB"/>
+            </w:tcBorders>
+          </w:tcPr>
+          <w:p>
+            <w:r>
+              <w:rPr>
+                <w:sz w:val="20"/>
+              </w:rPr>
+              <w:t xml:space="preserve">Ingestion pipeline (3.1): mỗi phase khai báo </w:t>
+            </w:r>
+            <w:r>
+              <w:rPr>
+                <w:rFonts w:ascii="Courier New" w:hAnsi="Courier New"/>
+                <w:color w:val="F05922"/>
+                <w:sz w:val="20"/>
+              </w:rPr>
+              <w:t>deps: [phaseA, phaseB]</w:t>
+            </w:r>
+            <w:r>
+              <w:rPr>
+                <w:sz w:val="20"/>
+              </w:rPr>
+              <w:t xml:space="preserve"> trong config; runner dùng Kahn's sort để validate DAG và ngăn hidden coupling giữa phases</w:t>
+            </w:r>
+          </w:p>
+        </w:tc>
+        <w:tc>
+          <w:tcPr>
+            <w:tcW w:type="dxa" w:w="1211"/>
+            <w:tcBorders>
+              <w:top w:val="single" w:sz="4" w:space="0" w:color="CBCBCB"/>
+              <w:left w:val="single" w:sz="4" w:space="0" w:color="CBCBCB"/>
+              <w:bottom w:val="single" w:sz="4" w:space="0" w:color="CBCBCB"/>
+              <w:right w:val="single" w:sz="4" w:space="0" w:color="CBCBCB"/>
+            </w:tcBorders>
+          </w:tcPr>
+          <w:p>
+            <w:r>
+              <w:rPr>
+                <w:sz w:val="20"/>
+              </w:rPr>
+              <w:t>task-planner có thể giao bước 3.1 khi 2.3 chưa done vì không có machine-readable deps — người dùng phải đọc bảng MASTER thủ công để kiểm tra</w:t>
+            </w:r>
+          </w:p>
+        </w:tc>
+        <w:tc>
+          <w:tcPr>
+            <w:tcW w:type="dxa" w:w="1211"/>
+            <w:tcBorders>
+              <w:top w:val="single" w:sz="4" w:space="0" w:color="CBCBCB"/>
+              <w:left w:val="single" w:sz="4" w:space="0" w:color="CBCBCB"/>
+              <w:bottom w:val="single" w:sz="4" w:space="0" w:color="CBCBCB"/>
+              <w:right w:val="single" w:sz="4" w:space="0" w:color="CBCBCB"/>
+            </w:tcBorders>
+          </w:tcPr>
+          <w:p>
+            <w:r>
+              <w:rPr>
+                <w:sz w:val="20"/>
+              </w:rPr>
+              <w:t xml:space="preserve">PLAN-STEP-template.md (thêm field </w:t>
+            </w:r>
+            <w:r>
+              <w:rPr>
+                <w:rFonts w:ascii="Courier New" w:hAnsi="Courier New"/>
+                <w:color w:val="F05922"/>
+                <w:sz w:val="20"/>
+              </w:rPr>
+              <w:t>deps:</w:t>
+            </w:r>
+            <w:r>
+              <w:rPr>
+                <w:sz w:val="20"/>
+              </w:rPr>
+              <w:t xml:space="preserve"> vào frontmatter); task-planner.md (thêm 1 validation step: trước khi mark bước là "ready", kiểm tra tất cả deps trong frontmatter có status ✅ không)</w:t>
+            </w:r>
+          </w:p>
+        </w:tc>
+        <w:tc>
+          <w:tcPr>
+            <w:tcW w:type="dxa" w:w="1211"/>
+            <w:tcBorders>
+              <w:top w:val="single" w:sz="4" w:space="0" w:color="CBCBCB"/>
+              <w:left w:val="single" w:sz="4" w:space="0" w:color="CBCBCB"/>
+              <w:bottom w:val="single" w:sz="4" w:space="0" w:color="CBCBCB"/>
+              <w:right w:val="single" w:sz="4" w:space="0" w:color="CBCBCB"/>
+            </w:tcBorders>
+          </w:tcPr>
+          <w:p>
+            <w:r>
+              <w:rPr>
+                <w:sz w:val="20"/>
+              </w:rPr>
+              <w:t>task-planner tự phát hiện nếu bước được giao khi dep chưa done → BLOCK + báo rõ "Bước 2.3 chưa ✅, không thể bắt đầu 3.1" thay vì chạy sai thứ tự; giảm sai sót trong plan có nhánh song song</w:t>
+            </w:r>
+          </w:p>
+        </w:tc>
+        <w:tc>
+          <w:tcPr>
+            <w:tcW w:type="dxa" w:w="1211"/>
+            <w:tcBorders>
+              <w:top w:val="single" w:sz="4" w:space="0" w:color="CBCBCB"/>
+              <w:left w:val="single" w:sz="4" w:space="0" w:color="CBCBCB"/>
+              <w:bottom w:val="single" w:sz="4" w:space="0" w:color="CBCBCB"/>
+              <w:right w:val="single" w:sz="4" w:space="0" w:color="CBCBCB"/>
+            </w:tcBorders>
+          </w:tcPr>
+          <w:p>
+            <w:r>
+              <w:rPr>
+                <w:sz w:val="20"/>
+              </w:rPr>
+              <w:t>Thấp-trung — sửa 2 file template + 1 đoạn validation logic trong task-planner.md; không ảnh hưởng plan cũ (backward compatible — field mới không bắt buộc)</w:t>
+            </w:r>
+          </w:p>
+        </w:tc>
+      </w:tr>
+      <w:tr>
+        <w:tc>
+          <w:tcPr>
+            <w:tcW w:type="dxa" w:w="1211"/>
+            <w:shd w:val="clear" w:color="auto" w:fill="B8B3D6"/>
+            <w:tcBorders>
+              <w:top w:val="single" w:sz="4" w:space="0" w:color="CBCBCB"/>
+              <w:left w:val="single" w:sz="4" w:space="0" w:color="CBCBCB"/>
+              <w:bottom w:val="single" w:sz="4" w:space="0" w:color="CBCBCB"/>
+              <w:right w:val="single" w:sz="4" w:space="0" w:color="CBCBCB"/>
+            </w:tcBorders>
+          </w:tcPr>
+          <w:p>
+            <w:r>
+              <w:rPr>
+                <w:sz w:val="20"/>
+              </w:rPr>
+              <w:t>GX-3</w:t>
+            </w:r>
+          </w:p>
+        </w:tc>
+        <w:tc>
+          <w:tcPr>
+            <w:tcW w:type="dxa" w:w="1211"/>
+            <w:shd w:val="clear" w:color="auto" w:fill="B8B3D6"/>
+            <w:tcBorders>
+              <w:top w:val="single" w:sz="4" w:space="0" w:color="CBCBCB"/>
+              <w:left w:val="single" w:sz="4" w:space="0" w:color="CBCBCB"/>
+              <w:bottom w:val="single" w:sz="4" w:space="0" w:color="CBCBCB"/>
+              <w:right w:val="single" w:sz="4" w:space="0" w:color="CBCBCB"/>
+            </w:tcBorders>
+          </w:tcPr>
+          <w:p>
+            <w:r>
+              <w:rPr>
+                <w:sz w:val="20"/>
+              </w:rPr>
+              <w:t xml:space="preserve">Skill </w:t>
+            </w:r>
+            <w:r>
+              <w:rPr>
+                <w:rFonts w:ascii="Courier New" w:hAnsi="Courier New"/>
+                <w:color w:val="F05922"/>
+                <w:sz w:val="20"/>
+              </w:rPr>
+              <w:t>/detect-impact</w:t>
+            </w:r>
+            <w:r>
+              <w:rPr>
+                <w:sz w:val="20"/>
+              </w:rPr>
+              <w:t xml:space="preserve"> — semi-automate phần CODE-GRAPH impact trong PR</w:t>
+            </w:r>
+          </w:p>
+        </w:tc>
+        <w:tc>
+          <w:tcPr>
+            <w:tcW w:type="dxa" w:w="1211"/>
+            <w:shd w:val="clear" w:color="auto" w:fill="B8B3D6"/>
+            <w:tcBorders>
+              <w:top w:val="single" w:sz="4" w:space="0" w:color="CBCBCB"/>
+              <w:left w:val="single" w:sz="4" w:space="0" w:color="CBCBCB"/>
+              <w:bottom w:val="single" w:sz="4" w:space="0" w:color="CBCBCB"/>
+              <w:right w:val="single" w:sz="4" w:space="0" w:color="CBCBCB"/>
+            </w:tcBorders>
+          </w:tcPr>
+          <w:p>
+            <w:r>
+              <w:rPr>
+                <w:sz w:val="20"/>
+              </w:rPr>
+              <w:t>§15.3: agent phải tự đọc CODE-GRAPH.md, đối chiếu với files đã thay đổi, suy luận module bị ảnh hưởng, rồi viết impact section — tất cả thủ công, dễ bỏ sót khi code change lớn</w:t>
+            </w:r>
+          </w:p>
+        </w:tc>
+        <w:tc>
+          <w:tcPr>
+            <w:tcW w:type="dxa" w:w="1211"/>
+            <w:shd w:val="clear" w:color="auto" w:fill="B8B3D6"/>
+            <w:tcBorders>
+              <w:top w:val="single" w:sz="4" w:space="0" w:color="CBCBCB"/>
+              <w:left w:val="single" w:sz="4" w:space="0" w:color="CBCBCB"/>
+              <w:bottom w:val="single" w:sz="4" w:space="0" w:color="CBCBCB"/>
+              <w:right w:val="single" w:sz="4" w:space="0" w:color="CBCBCB"/>
+            </w:tcBorders>
+          </w:tcPr>
+          <w:p>
+            <w:r>
+              <w:rPr>
+                <w:rFonts w:ascii="Courier New" w:hAnsi="Courier New"/>
+                <w:color w:val="F05922"/>
+                <w:sz w:val="20"/>
+              </w:rPr>
+              <w:t>detect_changes</w:t>
+            </w:r>
+            <w:r>
+              <w:rPr>
+                <w:sz w:val="20"/>
+              </w:rPr>
+              <w:t xml:space="preserve"> tool (3.4): nhận git diff → map file thay đổi → tìm node trong graph → trả về affected symbols và processes liên quan; một query thay vì traverse thủ công nhiều bước</w:t>
+            </w:r>
+          </w:p>
+        </w:tc>
+        <w:tc>
+          <w:tcPr>
+            <w:tcW w:type="dxa" w:w="1211"/>
+            <w:shd w:val="clear" w:color="auto" w:fill="B8B3D6"/>
+            <w:tcBorders>
+              <w:top w:val="single" w:sz="4" w:space="0" w:color="CBCBCB"/>
+              <w:left w:val="single" w:sz="4" w:space="0" w:color="CBCBCB"/>
+              <w:bottom w:val="single" w:sz="4" w:space="0" w:color="CBCBCB"/>
+              <w:right w:val="single" w:sz="4" w:space="0" w:color="CBCBCB"/>
+            </w:tcBorders>
+          </w:tcPr>
+          <w:p>
+            <w:r>
+              <w:rPr>
+                <w:sz w:val="20"/>
+              </w:rPr>
+              <w:t>Agent viết impact section dựa trên "nhớ từ CODE-GRAPH" hay "Grep nhanh" → dễ sót module có indirect relationship; PR có nhiều file thay đổi → effort cao, chất lượng thấp</w:t>
+            </w:r>
+          </w:p>
+        </w:tc>
+        <w:tc>
+          <w:tcPr>
+            <w:tcW w:type="dxa" w:w="1211"/>
+            <w:shd w:val="clear" w:color="auto" w:fill="B8B3D6"/>
+            <w:tcBorders>
+              <w:top w:val="single" w:sz="4" w:space="0" w:color="CBCBCB"/>
+              <w:left w:val="single" w:sz="4" w:space="0" w:color="CBCBCB"/>
+              <w:bottom w:val="single" w:sz="4" w:space="0" w:color="CBCBCB"/>
+              <w:right w:val="single" w:sz="4" w:space="0" w:color="CBCBCB"/>
+            </w:tcBorders>
+          </w:tcPr>
+          <w:p>
+            <w:r>
+              <w:rPr>
+                <w:sz w:val="20"/>
+              </w:rPr>
+              <w:t xml:space="preserve">Tạo mới </w:t>
+            </w:r>
+            <w:r>
+              <w:rPr>
+                <w:rFonts w:ascii="Courier New" w:hAnsi="Courier New"/>
+                <w:color w:val="F05922"/>
+                <w:sz w:val="20"/>
+              </w:rPr>
+              <w:t>.claude/commands/detect-impact.md</w:t>
+            </w:r>
+            <w:r>
+              <w:rPr>
+                <w:sz w:val="20"/>
+              </w:rPr>
+              <w:t xml:space="preserve"> (skill </w:t>
+            </w:r>
+            <w:r>
+              <w:rPr>
+                <w:rFonts w:ascii="Courier New" w:hAnsi="Courier New"/>
+                <w:color w:val="F05922"/>
+                <w:sz w:val="20"/>
+              </w:rPr>
+              <w:t>/detect-impact</w:t>
+            </w:r>
+            <w:r>
+              <w:rPr>
+                <w:sz w:val="20"/>
+              </w:rPr>
+              <w:t xml:space="preserve">); skill sẽ: (1) chạy </w:t>
+            </w:r>
+            <w:r>
+              <w:rPr>
+                <w:rFonts w:ascii="Courier New" w:hAnsi="Courier New"/>
+                <w:color w:val="F05922"/>
+                <w:sz w:val="20"/>
+              </w:rPr>
+              <w:t>git diff --name-only HEAD</w:t>
+            </w:r>
+            <w:r>
+              <w:rPr>
+                <w:sz w:val="20"/>
+              </w:rPr>
+              <w:t xml:space="preserve">, (2) Read CODE-GRAPH.md, (3) traverse quan hệ </w:t>
+            </w:r>
+            <w:r>
+              <w:rPr>
+                <w:rFonts w:ascii="Courier New" w:hAnsi="Courier New"/>
+                <w:color w:val="F05922"/>
+                <w:sz w:val="20"/>
+              </w:rPr>
+              <w:t>Callers/Used-by</w:t>
+            </w:r>
+            <w:r>
+              <w:rPr>
+                <w:sz w:val="20"/>
+              </w:rPr>
+              <w:t xml:space="preserve"> cho mỗi module thay đổi, (4) output template-filled depth-1/depth-2 impact cho paste vào PR checklist</w:t>
+            </w:r>
+          </w:p>
+        </w:tc>
+        <w:tc>
+          <w:tcPr>
+            <w:tcW w:type="dxa" w:w="1211"/>
+            <w:shd w:val="clear" w:color="auto" w:fill="B8B3D6"/>
+            <w:tcBorders>
+              <w:top w:val="single" w:sz="4" w:space="0" w:color="CBCBCB"/>
+              <w:left w:val="single" w:sz="4" w:space="0" w:color="CBCBCB"/>
+              <w:bottom w:val="single" w:sz="4" w:space="0" w:color="CBCBCB"/>
+              <w:right w:val="single" w:sz="4" w:space="0" w:color="CBCBCB"/>
+            </w:tcBorders>
+          </w:tcPr>
+          <w:p>
+            <w:r>
+              <w:rPr>
+                <w:sz w:val="20"/>
+              </w:rPr>
+              <w:t>Thời gian viết PR checklist giảm từ "đọc CODE-GRAPH + suy luận thủ công" → "chạy skill + paste output"; chất lượng tăng vì bước (3) là deterministic lookup, không phụ thuộc "agent có nhớ"</w:t>
+            </w:r>
+          </w:p>
+        </w:tc>
+        <w:tc>
+          <w:tcPr>
+            <w:tcW w:type="dxa" w:w="1211"/>
+            <w:shd w:val="clear" w:color="auto" w:fill="B8B3D6"/>
+            <w:tcBorders>
+              <w:top w:val="single" w:sz="4" w:space="0" w:color="CBCBCB"/>
+              <w:left w:val="single" w:sz="4" w:space="0" w:color="CBCBCB"/>
+              <w:bottom w:val="single" w:sz="4" w:space="0" w:color="CBCBCB"/>
+              <w:right w:val="single" w:sz="4" w:space="0" w:color="CBCBCB"/>
+            </w:tcBorders>
+          </w:tcPr>
+          <w:p>
+            <w:r>
+              <w:rPr>
+                <w:sz w:val="20"/>
+              </w:rPr>
+              <w:t xml:space="preserve">Trung — tạo file skill mới + EVAL theo §18.5; cần CODE-GRAPH.md có cột </w:t>
+            </w:r>
+            <w:r>
+              <w:rPr>
+                <w:rFonts w:ascii="Courier New" w:hAnsi="Courier New"/>
+                <w:color w:val="F05922"/>
+                <w:sz w:val="20"/>
+              </w:rPr>
+              <w:t>Callers/Used-by</w:t>
+            </w:r>
+            <w:r>
+              <w:rPr>
+                <w:sz w:val="20"/>
+              </w:rPr>
+              <w:t xml:space="preserve"> (phụ thuộc GX-1 được áp dụng trước)</w:t>
+            </w:r>
+          </w:p>
+        </w:tc>
+      </w:tr>
+      <w:tr>
+        <w:tc>
+          <w:tcPr>
+            <w:tcW w:type="dxa" w:w="1211"/>
+            <w:tcBorders>
+              <w:top w:val="single" w:sz="4" w:space="0" w:color="CBCBCB"/>
+              <w:left w:val="single" w:sz="4" w:space="0" w:color="CBCBCB"/>
+              <w:bottom w:val="single" w:sz="4" w:space="0" w:color="CBCBCB"/>
+              <w:right w:val="single" w:sz="4" w:space="0" w:color="CBCBCB"/>
+            </w:tcBorders>
+          </w:tcPr>
+          <w:p>
+            <w:r>
+              <w:rPr>
+                <w:sz w:val="20"/>
+              </w:rPr>
+              <w:t>GX-4</w:t>
+            </w:r>
+          </w:p>
+        </w:tc>
+        <w:tc>
+          <w:tcPr>
+            <w:tcW w:type="dxa" w:w="1211"/>
+            <w:tcBorders>
+              <w:top w:val="single" w:sz="4" w:space="0" w:color="CBCBCB"/>
+              <w:left w:val="single" w:sz="4" w:space="0" w:color="CBCBCB"/>
+              <w:bottom w:val="single" w:sz="4" w:space="0" w:color="CBCBCB"/>
+              <w:right w:val="single" w:sz="4" w:space="0" w:color="CBCBCB"/>
+            </w:tcBorders>
+          </w:tcPr>
+          <w:p>
+            <w:r>
+              <w:rPr>
+                <w:sz w:val="20"/>
+              </w:rPr>
+              <w:t xml:space="preserve">Cột </w:t>
+            </w:r>
+            <w:r>
+              <w:rPr>
+                <w:rFonts w:ascii="Courier New" w:hAnsi="Courier New"/>
+                <w:color w:val="F05922"/>
+                <w:sz w:val="20"/>
+              </w:rPr>
+              <w:t>Last verified</w:t>
+            </w:r>
+            <w:r>
+              <w:rPr>
+                <w:sz w:val="20"/>
+              </w:rPr>
+              <w:t xml:space="preserve"> trong CODE-GRAPH để flag stale CONFIDENT entries</w:t>
+            </w:r>
+          </w:p>
+        </w:tc>
+        <w:tc>
+          <w:tcPr>
+            <w:tcW w:type="dxa" w:w="1211"/>
+            <w:tcBorders>
+              <w:top w:val="single" w:sz="4" w:space="0" w:color="CBCBCB"/>
+              <w:left w:val="single" w:sz="4" w:space="0" w:color="CBCBCB"/>
+              <w:bottom w:val="single" w:sz="4" w:space="0" w:color="CBCBCB"/>
+              <w:right w:val="single" w:sz="4" w:space="0" w:color="CBCBCB"/>
+            </w:tcBorders>
+          </w:tcPr>
+          <w:p>
+            <w:r>
+              <w:rPr>
+                <w:sz w:val="20"/>
+              </w:rPr>
+              <w:t xml:space="preserve">CODE-GRAPH-template.md: cột </w:t>
+            </w:r>
+            <w:r>
+              <w:rPr>
+                <w:rFonts w:ascii="Courier New" w:hAnsi="Courier New"/>
+                <w:color w:val="F05922"/>
+                <w:sz w:val="20"/>
+              </w:rPr>
+              <w:t>Confidence</w:t>
+            </w:r>
+            <w:r>
+              <w:rPr>
+                <w:sz w:val="20"/>
+              </w:rPr>
+              <w:t xml:space="preserve"> có 3 label (CONFIRMED/INFERRED/UNCERTAIN) nhưng không có ngày xác nhận; entry CONFIRMED từ 3 tháng trước vẫn hiển thị như mới — không có signal nào báo cần re-verify</w:t>
+            </w:r>
+          </w:p>
+        </w:tc>
+        <w:tc>
+          <w:tcPr>
+            <w:tcW w:type="dxa" w:w="1211"/>
+            <w:tcBorders>
+              <w:top w:val="single" w:sz="4" w:space="0" w:color="CBCBCB"/>
+              <w:left w:val="single" w:sz="4" w:space="0" w:color="CBCBCB"/>
+              <w:bottom w:val="single" w:sz="4" w:space="0" w:color="CBCBCB"/>
+              <w:right w:val="single" w:sz="4" w:space="0" w:color="CBCBCB"/>
+            </w:tcBorders>
+          </w:tcPr>
+          <w:p>
+            <w:r>
+              <w:rPr>
+                <w:sz w:val="20"/>
+              </w:rPr>
+              <w:t xml:space="preserve">Incremental indexing (3.6): detect stale bằng </w:t>
+            </w:r>
+            <w:r>
+              <w:rPr>
+                <w:rFonts w:ascii="Courier New" w:hAnsi="Courier New"/>
+                <w:color w:val="F05922"/>
+                <w:sz w:val="20"/>
+              </w:rPr>
+              <w:t>lastCommit == HEAD</w:t>
+            </w:r>
+            <w:r>
+              <w:rPr>
+                <w:sz w:val="20"/>
+              </w:rPr>
+              <w:t xml:space="preserve"> — nếu commit HEAD khác lần index cuối → re-parse; không giữ stale data âm thầm</w:t>
+            </w:r>
+          </w:p>
+        </w:tc>
+        <w:tc>
+          <w:tcPr>
+            <w:tcW w:type="dxa" w:w="1211"/>
+            <w:tcBorders>
+              <w:top w:val="single" w:sz="4" w:space="0" w:color="CBCBCB"/>
+              <w:left w:val="single" w:sz="4" w:space="0" w:color="CBCBCB"/>
+              <w:bottom w:val="single" w:sz="4" w:space="0" w:color="CBCBCB"/>
+              <w:right w:val="single" w:sz="4" w:space="0" w:color="CBCBCB"/>
+            </w:tcBorders>
+          </w:tcPr>
+          <w:p>
+            <w:r>
+              <w:rPr>
+                <w:sz w:val="20"/>
+              </w:rPr>
+              <w:t>CONFIRMED entry hôm nay có thể sai sau khi code đổi — agent đọc CODE-GRAPH tin vào CONFIRMED nhưng thực tế module đó đã được refactor; §17.2 chỉ nói "UNCERTAIN → phải đọc source" nhưng không có cơ chế biến CONFIRMED thành UNCERTAIN khi code thay đổi</w:t>
+            </w:r>
+          </w:p>
+        </w:tc>
+        <w:tc>
+          <w:tcPr>
+            <w:tcW w:type="dxa" w:w="1211"/>
+            <w:tcBorders>
+              <w:top w:val="single" w:sz="4" w:space="0" w:color="CBCBCB"/>
+              <w:left w:val="single" w:sz="4" w:space="0" w:color="CBCBCB"/>
+              <w:bottom w:val="single" w:sz="4" w:space="0" w:color="CBCBCB"/>
+              <w:right w:val="single" w:sz="4" w:space="0" w:color="CBCBCB"/>
+            </w:tcBorders>
+          </w:tcPr>
+          <w:p>
+            <w:r>
+              <w:rPr>
+                <w:sz w:val="20"/>
+              </w:rPr>
+              <w:t xml:space="preserve">CODE-GRAPH-template.md (thêm cột </w:t>
+            </w:r>
+            <w:r>
+              <w:rPr>
+                <w:rFonts w:ascii="Courier New" w:hAnsi="Courier New"/>
+                <w:color w:val="F05922"/>
+                <w:sz w:val="20"/>
+              </w:rPr>
+              <w:t>Last verified: YYYY-MM-DD</w:t>
+            </w:r>
+            <w:r>
+              <w:rPr>
+                <w:sz w:val="20"/>
+              </w:rPr>
+              <w:t xml:space="preserve"> vào bảng Dependencies + Module chính); §17.2 CLAUDE.md (thêm rule: khi coding agent đọc CODE-GRAPH, nếu entry có </w:t>
+            </w:r>
+            <w:r>
+              <w:rPr>
+                <w:rFonts w:ascii="Courier New" w:hAnsi="Courier New"/>
+                <w:color w:val="F05922"/>
+                <w:sz w:val="20"/>
+              </w:rPr>
+              <w:t>Last verified</w:t>
+            </w:r>
+            <w:r>
+              <w:rPr>
+                <w:sz w:val="20"/>
+              </w:rPr>
+              <w:t xml:space="preserve"> cũ hơn 30 ngày VÀ file đó xuất hiện trong git log tuần qua → downgrade tạm sang UNCERTAIN, re-verify trước khi dùng)</w:t>
+            </w:r>
+          </w:p>
+        </w:tc>
+        <w:tc>
+          <w:tcPr>
+            <w:tcW w:type="dxa" w:w="1211"/>
+            <w:tcBorders>
+              <w:top w:val="single" w:sz="4" w:space="0" w:color="CBCBCB"/>
+              <w:left w:val="single" w:sz="4" w:space="0" w:color="CBCBCB"/>
+              <w:bottom w:val="single" w:sz="4" w:space="0" w:color="CBCBCB"/>
+              <w:right w:val="single" w:sz="4" w:space="0" w:color="CBCBCB"/>
+            </w:tcBorders>
+          </w:tcPr>
+          <w:p>
+            <w:r>
+              <w:rPr>
+                <w:sz w:val="20"/>
+              </w:rPr>
+              <w:t>Agent không còn tin mù vào CONFIRMED stale — phát hiện drift CODE-GRAPH vs code thực sớm hơn; giảm bug "agent làm theo CODE-GRAPH cũ, code thực tế đã đổi"</w:t>
+            </w:r>
+          </w:p>
+        </w:tc>
+        <w:tc>
+          <w:tcPr>
+            <w:tcW w:type="dxa" w:w="1211"/>
+            <w:tcBorders>
+              <w:top w:val="single" w:sz="4" w:space="0" w:color="CBCBCB"/>
+              <w:left w:val="single" w:sz="4" w:space="0" w:color="CBCBCB"/>
+              <w:bottom w:val="single" w:sz="4" w:space="0" w:color="CBCBCB"/>
+              <w:right w:val="single" w:sz="4" w:space="0" w:color="CBCBCB"/>
+            </w:tcBorders>
+          </w:tcPr>
+          <w:p>
+            <w:r>
+              <w:rPr>
+                <w:sz w:val="20"/>
+              </w:rPr>
+              <w:t>Thấp — sửa template + 3 dòng rule trong CLAUDE.md; không có automation, chỉ là quy tắc agent phải tuân theo</w:t>
+            </w:r>
+          </w:p>
+        </w:tc>
+      </w:tr>
+      <w:tr>
+        <w:tc>
+          <w:tcPr>
+            <w:tcW w:type="dxa" w:w="1211"/>
+            <w:shd w:val="clear" w:color="auto" w:fill="B8B3D6"/>
+            <w:tcBorders>
+              <w:top w:val="single" w:sz="4" w:space="0" w:color="CBCBCB"/>
+              <w:left w:val="single" w:sz="4" w:space="0" w:color="CBCBCB"/>
+              <w:bottom w:val="single" w:sz="4" w:space="0" w:color="CBCBCB"/>
+              <w:right w:val="single" w:sz="4" w:space="0" w:color="CBCBCB"/>
+            </w:tcBorders>
+          </w:tcPr>
+          <w:p>
+            <w:r>
+              <w:rPr>
+                <w:sz w:val="20"/>
+              </w:rPr>
+              <w:t>GX-5</w:t>
+            </w:r>
+          </w:p>
+        </w:tc>
+        <w:tc>
+          <w:tcPr>
+            <w:tcW w:type="dxa" w:w="1211"/>
+            <w:shd w:val="clear" w:color="auto" w:fill="B8B3D6"/>
+            <w:tcBorders>
+              <w:top w:val="single" w:sz="4" w:space="0" w:color="CBCBCB"/>
+              <w:left w:val="single" w:sz="4" w:space="0" w:color="CBCBCB"/>
+              <w:bottom w:val="single" w:sz="4" w:space="0" w:color="CBCBCB"/>
+              <w:right w:val="single" w:sz="4" w:space="0" w:color="CBCBCB"/>
+            </w:tcBorders>
+          </w:tcPr>
+          <w:p>
+            <w:r>
+              <w:rPr>
+                <w:sz w:val="20"/>
+              </w:rPr>
+              <w:t>Project-context skill hints tự sinh khi Phase 0 Audit (học từ skills auto-install pattern)</w:t>
+            </w:r>
+          </w:p>
+        </w:tc>
+        <w:tc>
+          <w:tcPr>
+            <w:tcW w:type="dxa" w:w="1211"/>
+            <w:shd w:val="clear" w:color="auto" w:fill="B8B3D6"/>
+            <w:tcBorders>
+              <w:top w:val="single" w:sz="4" w:space="0" w:color="CBCBCB"/>
+              <w:left w:val="single" w:sz="4" w:space="0" w:color="CBCBCB"/>
+              <w:bottom w:val="single" w:sz="4" w:space="0" w:color="CBCBCB"/>
+              <w:right w:val="single" w:sz="4" w:space="0" w:color="CBCBCB"/>
+            </w:tcBorders>
+          </w:tcPr>
+          <w:p>
+            <w:r>
+              <w:rPr>
+                <w:sz w:val="20"/>
+              </w:rPr>
+              <w:t xml:space="preserve">§3.0 Pre-0b: đọc </w:t>
+            </w:r>
+            <w:r>
+              <w:rPr>
+                <w:rFonts w:ascii="Courier New" w:hAnsi="Courier New"/>
+                <w:color w:val="F05922"/>
+                <w:sz w:val="20"/>
+              </w:rPr>
+              <w:t>docs/LESSONS.md</w:t>
+            </w:r>
+            <w:r>
+              <w:rPr>
+                <w:sz w:val="20"/>
+              </w:rPr>
+              <w:t xml:space="preserve"> 5-10 entry gần nhất; không có cơ chế tự sinh "gợi ý skill/command nào liên quan nhất cho project này" dựa trên CODE-GRAPH</w:t>
+            </w:r>
+          </w:p>
+        </w:tc>
+        <w:tc>
+          <w:tcPr>
+            <w:tcW w:type="dxa" w:w="1211"/>
+            <w:shd w:val="clear" w:color="auto" w:fill="B8B3D6"/>
+            <w:tcBorders>
+              <w:top w:val="single" w:sz="4" w:space="0" w:color="CBCBCB"/>
+              <w:left w:val="single" w:sz="4" w:space="0" w:color="CBCBCB"/>
+              <w:bottom w:val="single" w:sz="4" w:space="0" w:color="CBCBCB"/>
+              <w:right w:val="single" w:sz="4" w:space="0" w:color="CBCBCB"/>
+            </w:tcBorders>
+          </w:tcPr>
+          <w:p>
+            <w:r>
+              <w:rPr>
+                <w:rFonts w:ascii="Courier New" w:hAnsi="Courier New"/>
+                <w:color w:val="F05922"/>
+                <w:sz w:val="20"/>
+              </w:rPr>
+              <w:t>gitnexus analyze</w:t>
+            </w:r>
+            <w:r>
+              <w:rPr>
+                <w:sz w:val="20"/>
+              </w:rPr>
+              <w:t xml:space="preserve"> (3.5): tự detect functional areas từ Leiden community detection → sinh per-area skill file mô tả key files, entry points, cross-area connections; zero-friction adoption</w:t>
+            </w:r>
+          </w:p>
+        </w:tc>
+        <w:tc>
+          <w:tcPr>
+            <w:tcW w:type="dxa" w:w="1211"/>
+            <w:shd w:val="clear" w:color="auto" w:fill="B8B3D6"/>
+            <w:tcBorders>
+              <w:top w:val="single" w:sz="4" w:space="0" w:color="CBCBCB"/>
+              <w:left w:val="single" w:sz="4" w:space="0" w:color="CBCBCB"/>
+              <w:bottom w:val="single" w:sz="4" w:space="0" w:color="CBCBCB"/>
+              <w:right w:val="single" w:sz="4" w:space="0" w:color="CBCBCB"/>
+            </w:tcBorders>
+          </w:tcPr>
+          <w:p>
+            <w:r>
+              <w:rPr>
+                <w:sz w:val="20"/>
+              </w:rPr>
+              <w:t>Mỗi session mới, agent phải đọc lại CODE-GRAPH để biết project đang có gì → nếu project có 20+ module, không thể đọc hết trong Pre-0; không có "shortcut" gợi ý ngay khi bắt đầu task</w:t>
+            </w:r>
+          </w:p>
+        </w:tc>
+        <w:tc>
+          <w:tcPr>
+            <w:tcW w:type="dxa" w:w="1211"/>
+            <w:shd w:val="clear" w:color="auto" w:fill="B8B3D6"/>
+            <w:tcBorders>
+              <w:top w:val="single" w:sz="4" w:space="0" w:color="CBCBCB"/>
+              <w:left w:val="single" w:sz="4" w:space="0" w:color="CBCBCB"/>
+              <w:bottom w:val="single" w:sz="4" w:space="0" w:color="CBCBCB"/>
+              <w:right w:val="single" w:sz="4" w:space="0" w:color="CBCBCB"/>
+            </w:tcBorders>
+          </w:tcPr>
+          <w:p>
+            <w:r>
+              <w:rPr>
+                <w:sz w:val="20"/>
+              </w:rPr>
+              <w:t xml:space="preserve">task-planner.md (thêm 1 bước trong Pre-0b: sau khi đọc CODE-GRAPH.md, đọc bảng Module chính → lọc module liên quan đến task slug → ghi </w:t>
+            </w:r>
+            <w:r>
+              <w:rPr>
+                <w:rFonts w:ascii="Courier New" w:hAnsi="Courier New"/>
+                <w:color w:val="F05922"/>
+                <w:sz w:val="20"/>
+              </w:rPr>
+              <w:t>_workspace/CONTEXT-HINTS.md</w:t>
+            </w:r>
+            <w:r>
+              <w:rPr>
+                <w:sz w:val="20"/>
+              </w:rPr>
+              <w:t xml:space="preserve"> liệt kê: module liên quan, skill/command nên biết, UNCERTAIN entries cần watch out); hướng dẫn Dispatcher đọc file này trước giao việc cho agent đầu tiên</w:t>
+            </w:r>
+          </w:p>
+        </w:tc>
+        <w:tc>
+          <w:tcPr>
+            <w:tcW w:type="dxa" w:w="1211"/>
+            <w:shd w:val="clear" w:color="auto" w:fill="B8B3D6"/>
+            <w:tcBorders>
+              <w:top w:val="single" w:sz="4" w:space="0" w:color="CBCBCB"/>
+              <w:left w:val="single" w:sz="4" w:space="0" w:color="CBCBCB"/>
+              <w:bottom w:val="single" w:sz="4" w:space="0" w:color="CBCBCB"/>
+              <w:right w:val="single" w:sz="4" w:space="0" w:color="CBCBCB"/>
+            </w:tcBorders>
+          </w:tcPr>
+          <w:p>
+            <w:r>
+              <w:rPr>
+                <w:sz w:val="20"/>
+              </w:rPr>
+              <w:t>Dispatcher/agent đầu tiên nhận được "bản đồ rút gọn" (3-5 dòng) relevant cho task hiện tại thay vì phải đọc toàn bộ CODE-GRAPH; giảm 2-4 tool calls overhead mỗi session mới khi CODE-GRAPH lớn</w:t>
+            </w:r>
+          </w:p>
+        </w:tc>
+        <w:tc>
+          <w:tcPr>
+            <w:tcW w:type="dxa" w:w="1211"/>
+            <w:shd w:val="clear" w:color="auto" w:fill="B8B3D6"/>
+            <w:tcBorders>
+              <w:top w:val="single" w:sz="4" w:space="0" w:color="CBCBCB"/>
+              <w:left w:val="single" w:sz="4" w:space="0" w:color="CBCBCB"/>
+              <w:bottom w:val="single" w:sz="4" w:space="0" w:color="CBCBCB"/>
+              <w:right w:val="single" w:sz="4" w:space="0" w:color="CBCBCB"/>
+            </w:tcBorders>
+          </w:tcPr>
+          <w:p>
+            <w:r>
+              <w:rPr>
+                <w:sz w:val="20"/>
+              </w:rPr>
+              <w:t>Thấp-trung — sửa task-planner.md (thêm 1 bước) + hướng dẫn trong Pre-0b CLAUDE.md; không có gì phức tạp về kỹ thuật</w:t>
+            </w:r>
+          </w:p>
+        </w:tc>
+      </w:tr>
+      <w:tr>
+        <w:tc>
+          <w:tcPr>
+            <w:tcW w:type="dxa" w:w="1211"/>
+            <w:tcBorders>
+              <w:top w:val="single" w:sz="4" w:space="0" w:color="CBCBCB"/>
+              <w:left w:val="single" w:sz="4" w:space="0" w:color="CBCBCB"/>
+              <w:bottom w:val="single" w:sz="4" w:space="0" w:color="CBCBCB"/>
+              <w:right w:val="single" w:sz="4" w:space="0" w:color="CBCBCB"/>
+            </w:tcBorders>
+          </w:tcPr>
+          <w:p>
+            <w:r>
+              <w:rPr>
+                <w:sz w:val="20"/>
+              </w:rPr>
+              <w:t>GX-6</w:t>
+            </w:r>
+          </w:p>
+        </w:tc>
+        <w:tc>
+          <w:tcPr>
+            <w:tcW w:type="dxa" w:w="1211"/>
+            <w:tcBorders>
+              <w:top w:val="single" w:sz="4" w:space="0" w:color="CBCBCB"/>
+              <w:left w:val="single" w:sz="4" w:space="0" w:color="CBCBCB"/>
+              <w:bottom w:val="single" w:sz="4" w:space="0" w:color="CBCBCB"/>
+              <w:right w:val="single" w:sz="4" w:space="0" w:color="CBCBCB"/>
+            </w:tcBorders>
+          </w:tcPr>
+          <w:p>
+            <w:r>
+              <w:rPr>
+                <w:sz w:val="20"/>
+              </w:rPr>
+              <w:t>Structured Handoff Payload keys (readonly dep isolation pattern)</w:t>
+            </w:r>
+          </w:p>
+        </w:tc>
+        <w:tc>
+          <w:tcPr>
+            <w:tcW w:type="dxa" w:w="1211"/>
+            <w:tcBorders>
+              <w:top w:val="single" w:sz="4" w:space="0" w:color="CBCBCB"/>
+              <w:left w:val="single" w:sz="4" w:space="0" w:color="CBCBCB"/>
+              <w:bottom w:val="single" w:sz="4" w:space="0" w:color="CBCBCB"/>
+              <w:right w:val="single" w:sz="4" w:space="0" w:color="CBCBCB"/>
+            </w:tcBorders>
+          </w:tcPr>
+          <w:p>
+            <w:r>
+              <w:rPr>
+                <w:sz w:val="20"/>
+              </w:rPr>
+              <w:t>PLAN-STEP-template.md: "Handoff Log — bước sau cần biết" là free-text với 4 gợi ý (Đã làm, File đã đọc/đổi, Quyết định, Bước sau cần biết); Dispatcher truyền "nguyên văn" Handoff Log vào prompt kế tiếp; agent kế tiếp có thể đọc cả phần "Đã làm" dài và không liên quan</w:t>
+            </w:r>
+          </w:p>
+        </w:tc>
+        <w:tc>
+          <w:tcPr>
+            <w:tcW w:type="dxa" w:w="1211"/>
+            <w:tcBorders>
+              <w:top w:val="single" w:sz="4" w:space="0" w:color="CBCBCB"/>
+              <w:left w:val="single" w:sz="4" w:space="0" w:color="CBCBCB"/>
+              <w:bottom w:val="single" w:sz="4" w:space="0" w:color="CBCBCB"/>
+              <w:right w:val="single" w:sz="4" w:space="0" w:color="CBCBCB"/>
+            </w:tcBorders>
+          </w:tcPr>
+          <w:p>
+            <w:r>
+              <w:rPr>
+                <w:sz w:val="20"/>
+              </w:rPr>
+              <w:t xml:space="preserve">PipelineContext pattern (3.1): phase chỉ nhận </w:t>
+            </w:r>
+            <w:r>
+              <w:rPr>
+                <w:rFonts w:ascii="Courier New" w:hAnsi="Courier New"/>
+                <w:color w:val="F05922"/>
+                <w:sz w:val="20"/>
+              </w:rPr>
+              <w:t>ReadonlyMap&lt;string, PhaseResult&gt;</w:t>
+            </w:r>
+            <w:r>
+              <w:rPr>
+                <w:sz w:val="20"/>
+              </w:rPr>
+              <w:t xml:space="preserve"> của các dep đã khai báo — runner filter để ngăn phase sau đọc lén output của phase không phải dep; loại bỏ hidden coupling</w:t>
+            </w:r>
+          </w:p>
+        </w:tc>
+        <w:tc>
+          <w:tcPr>
+            <w:tcW w:type="dxa" w:w="1211"/>
+            <w:tcBorders>
+              <w:top w:val="single" w:sz="4" w:space="0" w:color="CBCBCB"/>
+              <w:left w:val="single" w:sz="4" w:space="0" w:color="CBCBCB"/>
+              <w:bottom w:val="single" w:sz="4" w:space="0" w:color="CBCBCB"/>
+              <w:right w:val="single" w:sz="4" w:space="0" w:color="CBCBCB"/>
+            </w:tcBorders>
+          </w:tcPr>
+          <w:p>
+            <w:r>
+              <w:rPr>
+                <w:sz w:val="20"/>
+              </w:rPr>
+              <w:t>Agent kế tiếp nhận Handoff Log dài (có cả "Đã làm" mô tả chi tiết) → phải đọc toàn bộ để tìm "bước sau cần biết"; mặt khác agent có thể bỏ qua do log dài → bỏ sót thông tin quan trọng</w:t>
+            </w:r>
+          </w:p>
+        </w:tc>
+        <w:tc>
+          <w:tcPr>
+            <w:tcW w:type="dxa" w:w="1211"/>
+            <w:tcBorders>
+              <w:top w:val="single" w:sz="4" w:space="0" w:color="CBCBCB"/>
+              <w:left w:val="single" w:sz="4" w:space="0" w:color="CBCBCB"/>
+              <w:bottom w:val="single" w:sz="4" w:space="0" w:color="CBCBCB"/>
+              <w:right w:val="single" w:sz="4" w:space="0" w:color="CBCBCB"/>
+            </w:tcBorders>
+          </w:tcPr>
+          <w:p>
+            <w:r>
+              <w:rPr>
+                <w:sz w:val="20"/>
+              </w:rPr>
+              <w:t xml:space="preserve">PLAN-STEP-template.md (chia "Handoff Log" thành 3 key rõ: </w:t>
+            </w:r>
+            <w:r>
+              <w:rPr>
+                <w:rFonts w:ascii="Courier New" w:hAnsi="Courier New"/>
+                <w:color w:val="F05922"/>
+                <w:sz w:val="20"/>
+              </w:rPr>
+              <w:t>do_not_redo</w:t>
+            </w:r>
+            <w:r>
+              <w:rPr>
+                <w:sz w:val="20"/>
+              </w:rPr>
+              <w:t xml:space="preserve">, </w:t>
+            </w:r>
+            <w:r>
+              <w:rPr>
+                <w:rFonts w:ascii="Courier New" w:hAnsi="Courier New"/>
+                <w:color w:val="F05922"/>
+                <w:sz w:val="20"/>
+              </w:rPr>
+              <w:t>watch_out</w:t>
+            </w:r>
+            <w:r>
+              <w:rPr>
+                <w:sz w:val="20"/>
+              </w:rPr>
+              <w:t xml:space="preserve">, </w:t>
+            </w:r>
+            <w:r>
+              <w:rPr>
+                <w:rFonts w:ascii="Courier New" w:hAnsi="Courier New"/>
+                <w:color w:val="F05922"/>
+                <w:sz w:val="20"/>
+              </w:rPr>
+              <w:t>next_inputs</w:t>
+            </w:r>
+            <w:r>
+              <w:rPr>
+                <w:sz w:val="20"/>
+              </w:rPr>
+              <w:t>); CLAUDE.md §16.4 (hướng dẫn Dispatcher chỉ trích xuất 3 key này để nhúng vào prompt kế tiếp, không truyền toàn bộ section "Đã làm")</w:t>
+            </w:r>
+          </w:p>
+        </w:tc>
+        <w:tc>
+          <w:tcPr>
+            <w:tcW w:type="dxa" w:w="1211"/>
+            <w:tcBorders>
+              <w:top w:val="single" w:sz="4" w:space="0" w:color="CBCBCB"/>
+              <w:left w:val="single" w:sz="4" w:space="0" w:color="CBCBCB"/>
+              <w:bottom w:val="single" w:sz="4" w:space="0" w:color="CBCBCB"/>
+              <w:right w:val="single" w:sz="4" w:space="0" w:color="CBCBCB"/>
+            </w:tcBorders>
+          </w:tcPr>
+          <w:p>
+            <w:r>
+              <w:rPr>
+                <w:sz w:val="20"/>
+              </w:rPr>
+              <w:t>Prompt của agent kế tiếp giảm noise: chỉ nhận 3 key cần thiết thay vì toàn bộ log; giảm trường hợp "agent bỏ qua Handoff Log vì quá dài" — 3 key ngắn dễ đọc hơn đoạn văn tự do</w:t>
+            </w:r>
+          </w:p>
+        </w:tc>
+        <w:tc>
+          <w:tcPr>
+            <w:tcW w:type="dxa" w:w="1211"/>
+            <w:tcBorders>
+              <w:top w:val="single" w:sz="4" w:space="0" w:color="CBCBCB"/>
+              <w:left w:val="single" w:sz="4" w:space="0" w:color="CBCBCB"/>
+              <w:bottom w:val="single" w:sz="4" w:space="0" w:color="CBCBCB"/>
+              <w:right w:val="single" w:sz="4" w:space="0" w:color="CBCBCB"/>
+            </w:tcBorders>
+          </w:tcPr>
+          <w:p>
+            <w:r>
+              <w:rPr>
+                <w:sz w:val="20"/>
+              </w:rPr>
+              <w:t>Thấp — chỉ sửa template + 2 đoạn hướng dẫn trong CLAUDE.md §16.4; backward compatible với step files hiện có (chỉ áp dụng cho plan mới)</w:t>
+            </w:r>
+          </w:p>
+        </w:tc>
+      </w:tr>
+    </w:tbl>
+    <w:p/>
+    <w:p>
+      <w:pPr>
+        <w:pBdr>
+          <w:bottom w:val="single" w:sz="6" w:space="1" w:color="F05922"/>
+        </w:pBdr>
+        <w:spacing w:after="120"/>
+      </w:pPr>
+    </w:p>
+    <w:p>
+      <w:pPr>
+        <w:pStyle w:val="Heading3"/>
+        <w:spacing w:before="160" w:after="60"/>
+      </w:pPr>
+      <w:r>
+        <w:rPr>
+          <w:color w:val="4A3F8C"/>
+          <w:sz w:val="24"/>
+        </w:rPr>
+        <w:t>Chi tiết từng đề xuất</w:t>
+      </w:r>
+    </w:p>
+    <w:p>
+      <w:pPr>
+        <w:pStyle w:val="Heading4"/>
+      </w:pPr>
+      <w:r>
+        <w:rPr>
+          <w:color w:val="251C53"/>
+          <w:sz w:val="22"/>
+        </w:rPr>
+        <w:t>GX-1: Depth-grouped impact taxonomy trong PR checklist</w:t>
+      </w:r>
+    </w:p>
+    <w:p>
+      <w:pPr>
+        <w:spacing w:after="80"/>
+      </w:pPr>
+      <w:r>
+        <w:rPr>
+          <w:b/>
+          <w:sz w:val="21"/>
+        </w:rPr>
+        <w:t>Học từ:</w:t>
+      </w:r>
+      <w:r>
+        <w:rPr>
+          <w:sz w:val="21"/>
+        </w:rPr>
+        <w:t xml:space="preserve"> </w:t>
+      </w:r>
+      <w:r>
+        <w:rPr>
+          <w:rFonts w:ascii="Courier New" w:hAnsi="Courier New"/>
+          <w:color w:val="F05922"/>
+          <w:sz w:val="18"/>
+        </w:rPr>
+        <w:t>impact</w:t>
+      </w:r>
+      <w:r>
+        <w:rPr>
+          <w:sz w:val="21"/>
+        </w:rPr>
+        <w:t xml:space="preserve"> MCP tool trong GitNexus — trả về blast radius với depth grouping (d=1: caller trực tiếp → WILL BREAK; d=2: caller của caller → LIKELY AFFECTED) và confidence score dựa trên type-of-edge. File tham chiếu: </w:t>
+      </w:r>
+      <w:r>
+        <w:rPr>
+          <w:rFonts w:ascii="Courier New" w:hAnsi="Courier New"/>
+          <w:color w:val="F05922"/>
+          <w:sz w:val="18"/>
+        </w:rPr>
+        <w:t>gitnexus/src/mcp/tools.ts</w:t>
+      </w:r>
+      <w:r>
+        <w:rPr>
+          <w:sz w:val="21"/>
+        </w:rPr>
+        <w:t xml:space="preserve"> (tool </w:t>
+      </w:r>
+      <w:r>
+        <w:rPr>
+          <w:rFonts w:ascii="Courier New" w:hAnsi="Courier New"/>
+          <w:color w:val="F05922"/>
+          <w:sz w:val="18"/>
+        </w:rPr>
+        <w:t>impact</w:t>
+      </w:r>
+      <w:r>
+        <w:rPr>
+          <w:sz w:val="21"/>
+        </w:rPr>
+        <w:t>).</w:t>
+      </w:r>
+    </w:p>
+    <w:p>
+      <w:pPr>
+        <w:spacing w:after="80"/>
+      </w:pPr>
+      <w:r>
+        <w:rPr>
+          <w:b/>
+          <w:sz w:val="21"/>
+        </w:rPr>
+        <w:t>Hiện trạng KZTEK:</w:t>
+      </w:r>
+      <w:r>
+        <w:rPr>
+          <w:sz w:val="21"/>
+        </w:rPr>
+        <w:t xml:space="preserve"> §15.3 CLAUDE.md ghi:</w:t>
+      </w:r>
+    </w:p>
+    <w:p>
+      <w:pPr>
+        <w:spacing w:before="40" w:after="40"/>
+        <w:ind w:left="567"/>
+        <w:pBdr>
+          <w:left w:val="single" w:sz="12" w:space="10" w:color="F05922"/>
+        </w:pBdr>
+      </w:pPr>
+      <w:r>
+        <w:rPr>
+          <w:color w:val="4A3F8C"/>
+        </w:rPr>
+        <w:t>"CODE-GRAPH impact: [liệt kê module/node bị ảnh hưởng (thêm/xóa/rename module, thay đổi API, DB schema, dependency), hoặc "Không có"]"</w:t>
+      </w:r>
+    </w:p>
+    <w:p>
+      <w:pPr>
+        <w:spacing w:after="80"/>
+      </w:pPr>
+      <w:r>
+        <w:rPr>
+          <w:sz w:val="21"/>
+        </w:rPr>
+        <w:t xml:space="preserve">Không có hướng dẫn depth, không có format mẫu → mỗi agent viết khác nhau. CODE-GRAPH-template.md không có cột </w:t>
+      </w:r>
+      <w:r>
+        <w:rPr>
+          <w:rFonts w:ascii="Courier New" w:hAnsi="Courier New"/>
+          <w:color w:val="F05922"/>
+          <w:sz w:val="18"/>
+        </w:rPr>
+        <w:t>Callers/Used-by</w:t>
+      </w:r>
+      <w:r>
+        <w:rPr>
+          <w:sz w:val="21"/>
+        </w:rPr>
+        <w:t xml:space="preserve"> → agent không có dữ liệu để traverse.</w:t>
+      </w:r>
+    </w:p>
+    <w:p>
+      <w:pPr>
+        <w:spacing w:after="80"/>
+      </w:pPr>
+      <w:r>
+        <w:rPr>
+          <w:b/>
+          <w:sz w:val="21"/>
+        </w:rPr>
+        <w:t>Thay đổi cần làm:</w:t>
+      </w:r>
+    </w:p>
+    <w:p>
+      <w:pPr>
+        <w:spacing w:after="20"/>
+        <w:ind w:left="567" w:hanging="283"/>
+      </w:pPr>
+      <w:r>
+        <w:rPr>
+          <w:sz w:val="21"/>
+        </w:rPr>
+        <w:t>1.</w:t>
+        <w:tab/>
+      </w:r>
+      <w:r>
+        <w:rPr>
+          <w:sz w:val="21"/>
+        </w:rPr>
+        <w:t xml:space="preserve">Trong </w:t>
+      </w:r>
+      <w:r>
+        <w:rPr>
+          <w:rFonts w:ascii="Courier New" w:hAnsi="Courier New"/>
+          <w:color w:val="F05922"/>
+          <w:sz w:val="21"/>
+        </w:rPr>
+        <w:t>CODE-GRAPH-template.md</w:t>
+      </w:r>
+      <w:r>
+        <w:rPr>
+          <w:sz w:val="21"/>
+        </w:rPr>
+        <w:t xml:space="preserve"> — bảng Module chính: thêm cột </w:t>
+      </w:r>
+      <w:r>
+        <w:rPr>
+          <w:rFonts w:ascii="Courier New" w:hAnsi="Courier New"/>
+          <w:color w:val="F05922"/>
+          <w:sz w:val="21"/>
+        </w:rPr>
+        <w:t>Callers/Used-by</w:t>
+      </w:r>
+      <w:r>
+        <w:rPr>
+          <w:sz w:val="21"/>
+        </w:rPr>
+        <w:t xml:space="preserve"> (danh sách module nào phụ thuộc vào module này)</w:t>
+      </w:r>
+    </w:p>
+    <w:p>
+      <w:pPr>
+        <w:spacing w:after="20"/>
+        <w:ind w:left="567" w:hanging="283"/>
+      </w:pPr>
+      <w:r>
+        <w:rPr>
+          <w:sz w:val="21"/>
+        </w:rPr>
+        <w:t>2.</w:t>
+        <w:tab/>
+      </w:r>
+      <w:r>
+        <w:rPr>
+          <w:sz w:val="21"/>
+        </w:rPr>
+        <w:t>Trong §15.3 CLAUDE.md — thay text hiện tại bằng:</w:t>
+      </w:r>
+    </w:p>
+    <w:p>
+      <w:pPr>
+        <w:spacing w:before="80" w:after="80"/>
+        <w:ind w:left="283"/>
+        <w:shd w:val="clear" w:color="auto" w:fill="F4F4F8"/>
+      </w:pPr>
+      <w:r>
+        <w:rPr>
+          <w:rFonts w:ascii="Courier New" w:hAnsi="Courier New"/>
+          <w:color w:val="251C53"/>
+          <w:sz w:val="18"/>
+        </w:rPr>
+        <w:t>- CODE-GRAPH impact:</w:t>
+        <w:br/>
+        <w:t xml:space="preserve">  - Depth-1 (WILL BREAK): [module/node CÓ quan hệ trực tiếp với phần đã thay đổi — liệt kê từ cột "Callers/Used-by" trong CODE-GRAPH]</w:t>
+        <w:br/>
+        <w:t xml:space="preserve">  - Depth-2 (LIKELY AFFECTED): [module/node gọi các module ở depth-1 — liệt kê nếu rõ ràng, hoặc "Cần trace thêm"]</w:t>
+        <w:br/>
+        <w:t xml:space="preserve">  - Nếu không có quan hệ: "Isolated change — không có module nào phụ thuộc"</w:t>
+      </w:r>
+    </w:p>
+    <w:p>
+      <w:pPr>
+        <w:spacing w:after="80"/>
+      </w:pPr>
+      <w:r>
+        <w:rPr>
+          <w:b/>
+          <w:sz w:val="21"/>
+        </w:rPr>
+        <w:t>Kết quả đạt được:</w:t>
+      </w:r>
+      <w:r>
+        <w:rPr>
+          <w:sz w:val="21"/>
+        </w:rPr>
+        <w:t xml:space="preserve"> Tech Lead nhìn vào PR checklist thấy ngay "depth-1: 2 module WILL BREAK" thay vì "module A liên quan" mơ hồ → quyết định review có depth ứng với rủi ro thực tế.</w:t>
+      </w:r>
+    </w:p>
+    <w:p>
+      <w:pPr>
+        <w:pBdr>
+          <w:bottom w:val="single" w:sz="6" w:space="1" w:color="F05922"/>
+        </w:pBdr>
+        <w:spacing w:after="120"/>
+      </w:pPr>
+    </w:p>
+    <w:p>
+      <w:pPr>
+        <w:pStyle w:val="Heading4"/>
+      </w:pPr>
+      <w:r>
+        <w:rPr>
+          <w:color w:val="251C53"/>
+          <w:sz w:val="22"/>
+        </w:rPr>
+        <w:t>GX-2: Field `deps` tường minh trong PLAN-STEP frontmatter</w:t>
+      </w:r>
+    </w:p>
+    <w:p>
+      <w:pPr>
+        <w:spacing w:after="80"/>
+      </w:pPr>
+      <w:r>
+        <w:rPr>
+          <w:b/>
+          <w:sz w:val="21"/>
+        </w:rPr>
+        <w:t>Học từ:</w:t>
+      </w:r>
+      <w:r>
+        <w:rPr>
+          <w:sz w:val="21"/>
+        </w:rPr>
+        <w:t xml:space="preserve"> Ingestion pipeline DAG của GitNexus — mỗi phase object có </w:t>
+      </w:r>
+      <w:r>
+        <w:rPr>
+          <w:rFonts w:ascii="Courier New" w:hAnsi="Courier New"/>
+          <w:color w:val="F05922"/>
+          <w:sz w:val="18"/>
+        </w:rPr>
+        <w:t>deps: string[]</w:t>
+      </w:r>
+      <w:r>
+        <w:rPr>
+          <w:sz w:val="21"/>
+        </w:rPr>
+        <w:t xml:space="preserve"> tường minh; runner thực hiện Kahn's topological sort, phát hiện cycle trước khi chạy. File tham chiếu: </w:t>
+      </w:r>
+      <w:r>
+        <w:rPr>
+          <w:rFonts w:ascii="Courier New" w:hAnsi="Courier New"/>
+          <w:color w:val="F05922"/>
+          <w:sz w:val="18"/>
+        </w:rPr>
+        <w:t>gitnexus/src/core/ingestion/pipeline-phases/runner.ts</w:t>
+      </w:r>
+      <w:r>
+        <w:rPr>
+          <w:sz w:val="21"/>
+        </w:rPr>
+        <w:t>.</w:t>
+      </w:r>
+    </w:p>
+    <w:p>
+      <w:pPr>
+        <w:spacing w:after="80"/>
+      </w:pPr>
+      <w:r>
+        <w:rPr>
+          <w:b/>
+          <w:sz w:val="21"/>
+        </w:rPr>
+        <w:t>Hiện trạng KZTEK:</w:t>
+      </w:r>
+      <w:r>
+        <w:rPr>
+          <w:sz w:val="21"/>
+        </w:rPr>
+        <w:t xml:space="preserve"> PLAN-STEP-template.md hiện tại chỉ có frontmatter:</w:t>
+      </w:r>
+    </w:p>
+    <w:p>
+      <w:pPr>
+        <w:spacing w:before="80" w:after="80"/>
+        <w:ind w:left="283"/>
+        <w:shd w:val="clear" w:color="auto" w:fill="F4F4F8"/>
+      </w:pPr>
+      <w:r>
+        <w:rPr>
+          <w:rFonts w:ascii="Courier New" w:hAnsi="Courier New"/>
+          <w:color w:val="251C53"/>
+          <w:sz w:val="18"/>
+        </w:rPr>
+        <w:t>---</w:t>
+        <w:br/>
+        <w:t>step: N.M</w:t>
+        <w:br/>
+        <w:t>plan: ../PLAN-MASTER.md</w:t>
+        <w:br/>
+        <w:t>agent: [agent phụ trách]</w:t>
+        <w:br/>
+        <w:t>status: todo</w:t>
+        <w:br/>
+        <w:t>completed_at:</w:t>
+        <w:br/>
+        <w:t>---</w:t>
+      </w:r>
+    </w:p>
+    <w:p>
+      <w:pPr>
+        <w:spacing w:after="80"/>
+      </w:pPr>
+      <w:r>
+        <w:rPr>
+          <w:sz w:val="21"/>
+        </w:rPr>
+        <w:t xml:space="preserve">Không có </w:t>
+      </w:r>
+      <w:r>
+        <w:rPr>
+          <w:rFonts w:ascii="Courier New" w:hAnsi="Courier New"/>
+          <w:color w:val="F05922"/>
+          <w:sz w:val="18"/>
+        </w:rPr>
+        <w:t>deps</w:t>
+      </w:r>
+      <w:r>
+        <w:rPr>
+          <w:sz w:val="21"/>
+        </w:rPr>
+        <w:t xml:space="preserve"> — task-planner kiểm tra deps bằng đọc PLAN-MASTER thủ công, không machine-readable.</w:t>
+      </w:r>
+    </w:p>
+    <w:p>
+      <w:pPr>
+        <w:spacing w:after="80"/>
+      </w:pPr>
+      <w:r>
+        <w:rPr>
+          <w:b/>
+          <w:sz w:val="21"/>
+        </w:rPr>
+        <w:t>Thay đổi cần làm:</w:t>
+      </w:r>
+    </w:p>
+    <w:p>
+      <w:pPr>
+        <w:spacing w:after="20"/>
+        <w:ind w:left="567" w:hanging="283"/>
+      </w:pPr>
+      <w:r>
+        <w:rPr>
+          <w:sz w:val="21"/>
+        </w:rPr>
+        <w:t>1.</w:t>
+        <w:tab/>
+      </w:r>
+      <w:r>
+        <w:rPr>
+          <w:sz w:val="21"/>
+        </w:rPr>
+        <w:t xml:space="preserve">Trong PLAN-STEP-template.md: thêm </w:t>
+      </w:r>
+      <w:r>
+        <w:rPr>
+          <w:rFonts w:ascii="Courier New" w:hAnsi="Courier New"/>
+          <w:color w:val="F05922"/>
+          <w:sz w:val="21"/>
+        </w:rPr>
+        <w:t>deps: []</w:t>
+      </w:r>
+      <w:r>
+        <w:rPr>
+          <w:sz w:val="21"/>
+        </w:rPr>
+        <w:t xml:space="preserve"> vào frontmatter (optional, để trống = no deps)</w:t>
+      </w:r>
+    </w:p>
+    <w:p>
+      <w:pPr>
+        <w:spacing w:after="20"/>
+        <w:ind w:left="567" w:hanging="283"/>
+      </w:pPr>
+      <w:r>
+        <w:rPr>
+          <w:sz w:val="21"/>
+        </w:rPr>
+        <w:t>2.</w:t>
+        <w:tab/>
+      </w:r>
+      <w:r>
+        <w:rPr>
+          <w:sz w:val="21"/>
+        </w:rPr>
+        <w:t>Trong task-planner.md: trước khi giao bước N.M cho agent, chạy pre-check:</w:t>
+      </w:r>
+    </w:p>
+    <w:p>
+      <w:pPr>
+        <w:pStyle w:val="ListBullet"/>
+        <w:spacing w:after="20"/>
+        <w:ind w:left="567"/>
+      </w:pPr>
+      <w:r>
+        <w:rPr>
+          <w:sz w:val="21"/>
+        </w:rPr>
+        <w:t xml:space="preserve">Đọc frontmatter </w:t>
+      </w:r>
+      <w:r>
+        <w:rPr>
+          <w:rFonts w:ascii="Courier New" w:hAnsi="Courier New"/>
+          <w:color w:val="F05922"/>
+          <w:sz w:val="21"/>
+        </w:rPr>
+        <w:t>deps:</w:t>
+      </w:r>
+      <w:r>
+        <w:rPr>
+          <w:sz w:val="21"/>
+        </w:rPr>
+        <w:t xml:space="preserve"> của step file</w:t>
+      </w:r>
+    </w:p>
+    <w:p>
+      <w:pPr>
+        <w:pStyle w:val="ListBullet"/>
+        <w:spacing w:after="20"/>
+        <w:ind w:left="567"/>
+      </w:pPr>
+      <w:r>
+        <w:rPr>
+          <w:sz w:val="21"/>
+        </w:rPr>
+        <w:t>Với mỗi dep step ID → tìm trong PLAN-MASTER, kiểm tra status ✅</w:t>
+      </w:r>
+    </w:p>
+    <w:p>
+      <w:pPr>
+        <w:pStyle w:val="ListBullet"/>
+        <w:spacing w:after="20"/>
+        <w:ind w:left="567"/>
+      </w:pPr>
+      <w:r>
+        <w:rPr>
+          <w:sz w:val="21"/>
+        </w:rPr>
+        <w:t>Nếu dep chưa done → BLOCK với thông báo "Bước [dep] chưa ✅"</w:t>
+      </w:r>
+    </w:p>
+    <w:p>
+      <w:pPr>
+        <w:spacing w:after="80"/>
+      </w:pPr>
+      <w:r>
+        <w:rPr>
+          <w:b/>
+          <w:sz w:val="21"/>
+        </w:rPr>
+        <w:t>Kết quả đạt được:</w:t>
+      </w:r>
+      <w:r>
+        <w:rPr>
+          <w:sz w:val="21"/>
+        </w:rPr>
+        <w:t xml:space="preserve"> Giảm từ "task-planner phải nhớ kiểm tra thủ công" → "validation tự động trước mỗi bước" → không bao giờ giao bước 3.1 khi 2.3 chưa xong, dù plan có nhánh song song phức tạp.</w:t>
+      </w:r>
+    </w:p>
+    <w:p>
+      <w:pPr>
+        <w:pBdr>
+          <w:bottom w:val="single" w:sz="6" w:space="1" w:color="F05922"/>
+        </w:pBdr>
+        <w:spacing w:after="120"/>
+      </w:pPr>
+    </w:p>
+    <w:p>
+      <w:pPr>
+        <w:pStyle w:val="Heading4"/>
+      </w:pPr>
+      <w:r>
+        <w:rPr>
+          <w:color w:val="251C53"/>
+          <w:sz w:val="22"/>
+        </w:rPr>
+        <w:t>GX-3: Skill `/detect-impact`</w:t>
+      </w:r>
+    </w:p>
+    <w:p>
+      <w:pPr>
+        <w:spacing w:after="80"/>
+      </w:pPr>
+      <w:r>
+        <w:rPr>
+          <w:b/>
+          <w:sz w:val="21"/>
+        </w:rPr>
+        <w:t>Học từ:</w:t>
+      </w:r>
+      <w:r>
+        <w:rPr>
+          <w:sz w:val="21"/>
+        </w:rPr>
+        <w:t xml:space="preserve"> </w:t>
+      </w:r>
+      <w:r>
+        <w:rPr>
+          <w:rFonts w:ascii="Courier New" w:hAnsi="Courier New"/>
+          <w:color w:val="F05922"/>
+          <w:sz w:val="18"/>
+        </w:rPr>
+        <w:t>detect_changes</w:t>
+      </w:r>
+      <w:r>
+        <w:rPr>
+          <w:sz w:val="21"/>
+        </w:rPr>
+        <w:t xml:space="preserve"> MCP tool của GitNexus — nhận git diff → map sang affected graph nodes → trả về theo process/functional area. Không cần agent tự traverse. File tham chiếu: </w:t>
+      </w:r>
+      <w:r>
+        <w:rPr>
+          <w:rFonts w:ascii="Courier New" w:hAnsi="Courier New"/>
+          <w:color w:val="F05922"/>
+          <w:sz w:val="18"/>
+        </w:rPr>
+        <w:t>gitnexus/src/mcp/tools.ts</w:t>
+      </w:r>
+      <w:r>
+        <w:rPr>
+          <w:sz w:val="21"/>
+        </w:rPr>
+        <w:t xml:space="preserve"> (tool </w:t>
+      </w:r>
+      <w:r>
+        <w:rPr>
+          <w:rFonts w:ascii="Courier New" w:hAnsi="Courier New"/>
+          <w:color w:val="F05922"/>
+          <w:sz w:val="18"/>
+        </w:rPr>
+        <w:t>detect_changes</w:t>
+      </w:r>
+      <w:r>
+        <w:rPr>
+          <w:sz w:val="21"/>
+        </w:rPr>
+        <w:t>).</w:t>
+      </w:r>
+    </w:p>
+    <w:p>
+      <w:pPr>
+        <w:spacing w:after="80"/>
+      </w:pPr>
+      <w:r>
+        <w:rPr>
+          <w:b/>
+          <w:sz w:val="21"/>
+        </w:rPr>
+        <w:t>Hiện trạng KZTEK:</w:t>
+      </w:r>
+      <w:r>
+        <w:rPr>
+          <w:sz w:val="21"/>
+        </w:rPr>
+        <w:t xml:space="preserve"> Không có skill tương đương. Agent viết PR checklist impact section theo trí nhớ / Grep thủ công.</w:t>
+      </w:r>
+    </w:p>
+    <w:p>
+      <w:pPr>
+        <w:spacing w:after="80"/>
+      </w:pPr>
+      <w:r>
+        <w:rPr>
+          <w:b/>
+          <w:sz w:val="21"/>
+        </w:rPr>
+        <w:t>Thay đổi cần làm:</w:t>
+      </w:r>
+      <w:r>
+        <w:rPr>
+          <w:sz w:val="21"/>
+        </w:rPr>
+        <w:t xml:space="preserve"> Tạo </w:t>
+      </w:r>
+      <w:r>
+        <w:rPr>
+          <w:rFonts w:ascii="Courier New" w:hAnsi="Courier New"/>
+          <w:color w:val="F05922"/>
+          <w:sz w:val="18"/>
+        </w:rPr>
+        <w:t>.claude/commands/detect-impact.md</w:t>
+      </w:r>
+      <w:r>
+        <w:rPr>
+          <w:sz w:val="21"/>
+        </w:rPr>
+        <w:t xml:space="preserve"> với flow:</w:t>
+      </w:r>
+    </w:p>
+    <w:p>
+      <w:pPr>
+        <w:spacing w:before="80" w:after="80"/>
+        <w:ind w:left="283"/>
+        <w:shd w:val="clear" w:color="auto" w:fill="F4F4F8"/>
+      </w:pPr>
+      <w:r>
+        <w:rPr>
+          <w:rFonts w:ascii="Courier New" w:hAnsi="Courier New"/>
+          <w:color w:val="251C53"/>
+          <w:sz w:val="18"/>
+        </w:rPr>
+        <w:t>1. git diff --name-only HEAD (lấy danh sách file thay đổi)</w:t>
+        <w:br/>
+        <w:t>2. Read code-graph/CODE-GRAPH.md (bảng Module + cột Callers/Used-by)</w:t>
+        <w:br/>
+        <w:t>3. Với mỗi file thay đổi → tìm module chứa nó → lấy Callers/Used-by → depth-1 list</w:t>
+        <w:br/>
+        <w:t>4. Với mỗi depth-1 module → lấy Callers/Used-by của chúng → depth-2 list</w:t>
+        <w:br/>
+        <w:t>5. Output: template-filled impact section sẵn để paste vào PR checklist §15.3</w:t>
+      </w:r>
+    </w:p>
+    <w:p>
+      <w:pPr>
+        <w:spacing w:after="80"/>
+      </w:pPr>
+      <w:r>
+        <w:rPr>
+          <w:sz w:val="21"/>
+        </w:rPr>
+        <w:t xml:space="preserve">Tạo </w:t>
+      </w:r>
+      <w:r>
+        <w:rPr>
+          <w:rFonts w:ascii="Courier New" w:hAnsi="Courier New"/>
+          <w:color w:val="F05922"/>
+          <w:sz w:val="18"/>
+        </w:rPr>
+        <w:t>.claude/evals/detect-impact.md</w:t>
+      </w:r>
+      <w:r>
+        <w:rPr>
+          <w:sz w:val="21"/>
+        </w:rPr>
+        <w:t xml:space="preserve"> với 3 CE (theo EDD §18.5) trước khi tạo skill.</w:t>
+      </w:r>
+    </w:p>
+    <w:p>
+      <w:pPr>
+        <w:spacing w:after="80"/>
+      </w:pPr>
+      <w:r>
+        <w:rPr>
+          <w:b/>
+          <w:sz w:val="21"/>
+        </w:rPr>
+        <w:t>Lưu ý:</w:t>
+      </w:r>
+      <w:r>
+        <w:rPr>
+          <w:sz w:val="21"/>
+        </w:rPr>
+        <w:t xml:space="preserve"> Skill này phụ thuộc GX-1 (cột </w:t>
+      </w:r>
+      <w:r>
+        <w:rPr>
+          <w:rFonts w:ascii="Courier New" w:hAnsi="Courier New"/>
+          <w:color w:val="F05922"/>
+          <w:sz w:val="18"/>
+        </w:rPr>
+        <w:t>Callers/Used-by</w:t>
+      </w:r>
+      <w:r>
+        <w:rPr>
+          <w:sz w:val="21"/>
+        </w:rPr>
+        <w:t xml:space="preserve"> phải có trong CODE-GRAPH-template.md trước). Nếu GX-1 chưa áp dụng → skill vẫn có thể hoạt động nhưng depth-1/depth-2 sẽ thiếu chính xác.</w:t>
+      </w:r>
+    </w:p>
+    <w:p>
+      <w:pPr>
+        <w:spacing w:after="80"/>
+      </w:pPr>
+      <w:r>
+        <w:rPr>
+          <w:b/>
+          <w:sz w:val="21"/>
+        </w:rPr>
+        <w:t>Kết quả đạt được:</w:t>
+      </w:r>
+      <w:r>
+        <w:rPr>
+          <w:sz w:val="21"/>
+        </w:rPr>
+        <w:t xml:space="preserve"> Thời gian viết PR impact section giảm từ ~5-10 phút (đọc + trace thủ công) → &lt;1 phút (chạy skill + paste); chất lượng nhất quán vì là lookup không phụ thuộc "agent có nhớ."</w:t>
+      </w:r>
+    </w:p>
+    <w:p>
+      <w:pPr>
+        <w:pBdr>
+          <w:bottom w:val="single" w:sz="6" w:space="1" w:color="F05922"/>
+        </w:pBdr>
+        <w:spacing w:after="120"/>
+      </w:pPr>
+    </w:p>
+    <w:p>
+      <w:pPr>
+        <w:pStyle w:val="Heading4"/>
+      </w:pPr>
+      <w:r>
+        <w:rPr>
+          <w:color w:val="251C53"/>
+          <w:sz w:val="22"/>
+        </w:rPr>
+        <w:t>GX-4: Cột `Last verified` trong CODE-GRAPH</w:t>
+      </w:r>
+    </w:p>
+    <w:p>
+      <w:pPr>
+        <w:spacing w:after="80"/>
+      </w:pPr>
+      <w:r>
+        <w:rPr>
+          <w:b/>
+          <w:sz w:val="21"/>
+        </w:rPr>
+        <w:t>Học từ:</w:t>
+      </w:r>
+      <w:r>
+        <w:rPr>
+          <w:sz w:val="21"/>
+        </w:rPr>
+        <w:t xml:space="preserve"> Incremental indexing của GitNexus — detect stale bằng </w:t>
+      </w:r>
+      <w:r>
+        <w:rPr>
+          <w:rFonts w:ascii="Courier New" w:hAnsi="Courier New"/>
+          <w:color w:val="F05922"/>
+          <w:sz w:val="18"/>
+        </w:rPr>
+        <w:t>lastCommit == HEAD</w:t>
+      </w:r>
+      <w:r>
+        <w:rPr>
+          <w:sz w:val="21"/>
+        </w:rPr>
+        <w:t xml:space="preserve">, re-index phần thay đổi, không giữ data cũ âm thầm. Confidence được tự động downgrade khi phát hiện stale. File tham chiếu: </w:t>
+      </w:r>
+      <w:r>
+        <w:rPr>
+          <w:rFonts w:ascii="Courier New" w:hAnsi="Courier New"/>
+          <w:color w:val="F05922"/>
+          <w:sz w:val="18"/>
+        </w:rPr>
+        <w:t>gitnexus/src/core/ingestion/pipeline-phases/</w:t>
+      </w:r>
+      <w:r>
+        <w:rPr>
+          <w:sz w:val="21"/>
+        </w:rPr>
+        <w:t xml:space="preserve"> (phase </w:t>
+      </w:r>
+      <w:r>
+        <w:rPr>
+          <w:rFonts w:ascii="Courier New" w:hAnsi="Courier New"/>
+          <w:color w:val="F05922"/>
+          <w:sz w:val="18"/>
+        </w:rPr>
+        <w:t>structure</w:t>
+      </w:r>
+      <w:r>
+        <w:rPr>
+          <w:sz w:val="21"/>
+        </w:rPr>
+        <w:t>).</w:t>
+      </w:r>
+    </w:p>
+    <w:p>
+      <w:pPr>
+        <w:spacing w:after="80"/>
+      </w:pPr>
+      <w:r>
+        <w:rPr>
+          <w:b/>
+          <w:sz w:val="21"/>
+        </w:rPr>
+        <w:t>Hiện trạng KZTEK:</w:t>
+      </w:r>
+      <w:r>
+        <w:rPr>
+          <w:sz w:val="21"/>
+        </w:rPr>
+        <w:t xml:space="preserve"> Confidence labels (CONFIRMED/INFERRED/UNCERTAIN) theo §17.2 không có ngày xác nhận. Entry CONFIRMED từ ngày tạo CODE-GRAPH giữ nguyên label dù code đã đổi nhiều lần.</w:t>
+      </w:r>
+    </w:p>
+    <w:p>
+      <w:pPr>
+        <w:spacing w:after="80"/>
+      </w:pPr>
+      <w:r>
+        <w:rPr>
+          <w:b/>
+          <w:sz w:val="21"/>
+        </w:rPr>
+        <w:t>Thay đổi cần làm:</w:t>
+      </w:r>
+    </w:p>
+    <w:p>
+      <w:pPr>
+        <w:spacing w:after="20"/>
+        <w:ind w:left="567" w:hanging="283"/>
+      </w:pPr>
+      <w:r>
+        <w:rPr>
+          <w:sz w:val="21"/>
+        </w:rPr>
+        <w:t>1.</w:t>
+        <w:tab/>
+      </w:r>
+      <w:r>
+        <w:rPr>
+          <w:sz w:val="21"/>
+        </w:rPr>
+        <w:t xml:space="preserve">CODE-GRAPH-template.md: thêm cột </w:t>
+      </w:r>
+      <w:r>
+        <w:rPr>
+          <w:rFonts w:ascii="Courier New" w:hAnsi="Courier New"/>
+          <w:color w:val="F05922"/>
+          <w:sz w:val="21"/>
+        </w:rPr>
+        <w:t>Last verified</w:t>
+      </w:r>
+      <w:r>
+        <w:rPr>
+          <w:sz w:val="21"/>
+        </w:rPr>
+        <w:t xml:space="preserve"> (YYYY-MM-DD) vào bảng Dependencies và Module chính</w:t>
+      </w:r>
+    </w:p>
+    <w:p>
+      <w:pPr>
+        <w:spacing w:after="20"/>
+        <w:ind w:left="567" w:hanging="283"/>
+      </w:pPr>
+      <w:r>
+        <w:rPr>
+          <w:sz w:val="21"/>
+        </w:rPr>
+        <w:t>2.</w:t>
+        <w:tab/>
+      </w:r>
+      <w:r>
+        <w:rPr>
+          <w:sz w:val="21"/>
+        </w:rPr>
+        <w:t xml:space="preserve">§17.2 CLAUDE.md: thêm rule — khi coding agent đọc CODE-GRAPH trước task, nếu gặp entry có </w:t>
+      </w:r>
+      <w:r>
+        <w:rPr>
+          <w:rFonts w:ascii="Courier New" w:hAnsi="Courier New"/>
+          <w:color w:val="F05922"/>
+          <w:sz w:val="21"/>
+        </w:rPr>
+        <w:t>Last verified</w:t>
+      </w:r>
+      <w:r>
+        <w:rPr>
+          <w:sz w:val="21"/>
+        </w:rPr>
+        <w:t xml:space="preserve"> &gt; 30 ngày trước ngày hiện tại VÀ module đó xuất hiện trong output </w:t>
+      </w:r>
+      <w:r>
+        <w:rPr>
+          <w:rFonts w:ascii="Courier New" w:hAnsi="Courier New"/>
+          <w:color w:val="F05922"/>
+          <w:sz w:val="21"/>
+        </w:rPr>
+        <w:t>git log --oneline -7</w:t>
+      </w:r>
+      <w:r>
+        <w:rPr>
+          <w:sz w:val="21"/>
+        </w:rPr>
+        <w:t xml:space="preserve"> → agent PHẢI re-verify bằng cách đọc source file trực tiếp trước khi dùng thông tin đó, không tin vào label CONFIRMED cũ</w:t>
+      </w:r>
+    </w:p>
+    <w:p>
+      <w:pPr>
+        <w:spacing w:after="80"/>
+      </w:pPr>
+      <w:r>
+        <w:rPr>
+          <w:b/>
+          <w:sz w:val="21"/>
+        </w:rPr>
+        <w:t>Kết quả đạt được:</w:t>
+      </w:r>
+      <w:r>
+        <w:rPr>
+          <w:sz w:val="21"/>
+        </w:rPr>
+        <w:t xml:space="preserve"> Agent phát hiện được "module này CONFIRMED từ 45 ngày trước và đã có 3 commit sửa nó tuần qua → cần re-verify" — giảm bug do agent tin CODE-GRAPH lạc hậu. Số lần agent làm sai vì dữ liệu CODE-GRAPH stale có thể đo bằng số incident/bug report loại này trong </w:t>
+      </w:r>
+      <w:r>
+        <w:rPr>
+          <w:rFonts w:ascii="Courier New" w:hAnsi="Courier New"/>
+          <w:color w:val="F05922"/>
+          <w:sz w:val="18"/>
+        </w:rPr>
+        <w:t>docs/LESSONS.md</w:t>
+      </w:r>
+      <w:r>
+        <w:rPr>
+          <w:sz w:val="21"/>
+        </w:rPr>
+        <w:t>.</w:t>
+      </w:r>
+    </w:p>
+    <w:p>
+      <w:pPr>
+        <w:pBdr>
+          <w:bottom w:val="single" w:sz="6" w:space="1" w:color="F05922"/>
+        </w:pBdr>
+        <w:spacing w:after="120"/>
+      </w:pPr>
+    </w:p>
+    <w:p>
+      <w:pPr>
+        <w:pStyle w:val="Heading4"/>
+      </w:pPr>
+      <w:r>
+        <w:rPr>
+          <w:color w:val="251C53"/>
+          <w:sz w:val="22"/>
+        </w:rPr>
+        <w:t>GX-5: Project-context skill hints tự sinh (Pre-0 Audit)</w:t>
+      </w:r>
+    </w:p>
+    <w:p>
+      <w:pPr>
+        <w:spacing w:after="80"/>
+      </w:pPr>
+      <w:r>
+        <w:rPr>
+          <w:b/>
+          <w:sz w:val="21"/>
+        </w:rPr>
+        <w:t>Học từ:</w:t>
+      </w:r>
+      <w:r>
+        <w:rPr>
+          <w:sz w:val="21"/>
+        </w:rPr>
+        <w:t xml:space="preserve"> Agent skills auto-install của GitNexus — </w:t>
+      </w:r>
+      <w:r>
+        <w:rPr>
+          <w:rFonts w:ascii="Courier New" w:hAnsi="Courier New"/>
+          <w:color w:val="F05922"/>
+          <w:sz w:val="18"/>
+        </w:rPr>
+        <w:t>gitnexus analyze</w:t>
+      </w:r>
+      <w:r>
+        <w:rPr>
+          <w:sz w:val="21"/>
+        </w:rPr>
+        <w:t xml:space="preserve"> detect functional areas qua Leiden community, sinh per-area skill file mô tả key files và cross-area connections. File tham chiếu: </w:t>
+      </w:r>
+      <w:r>
+        <w:rPr>
+          <w:rFonts w:ascii="Courier New" w:hAnsi="Courier New"/>
+          <w:color w:val="F05922"/>
+          <w:sz w:val="18"/>
+        </w:rPr>
+        <w:t>gitnexus/.claude/skills/</w:t>
+      </w:r>
+      <w:r>
+        <w:rPr>
+          <w:sz w:val="21"/>
+        </w:rPr>
+        <w:t xml:space="preserve"> (generated skill files), </w:t>
+      </w:r>
+      <w:r>
+        <w:rPr>
+          <w:rFonts w:ascii="Courier New" w:hAnsi="Courier New"/>
+          <w:color w:val="F05922"/>
+          <w:sz w:val="18"/>
+        </w:rPr>
+        <w:t>gitnexus/src/core/ingestion/pipeline-phases/communities.ts</w:t>
+      </w:r>
+      <w:r>
+        <w:rPr>
+          <w:sz w:val="21"/>
+        </w:rPr>
+        <w:t>.</w:t>
+      </w:r>
+    </w:p>
+    <w:p>
+      <w:pPr>
+        <w:spacing w:after="80"/>
+      </w:pPr>
+      <w:r>
+        <w:rPr>
+          <w:b/>
+          <w:sz w:val="21"/>
+        </w:rPr>
+        <w:t>Hiện trạng KZTEK:</w:t>
+      </w:r>
+      <w:r>
+        <w:rPr>
+          <w:sz w:val="21"/>
+        </w:rPr>
+        <w:t xml:space="preserve"> §3.0 Pre-0b — đọc </w:t>
+      </w:r>
+      <w:r>
+        <w:rPr>
+          <w:rFonts w:ascii="Courier New" w:hAnsi="Courier New"/>
+          <w:color w:val="F05922"/>
+          <w:sz w:val="18"/>
+        </w:rPr>
+        <w:t>docs/LESSONS.md</w:t>
+      </w:r>
+      <w:r>
+        <w:rPr>
+          <w:sz w:val="21"/>
+        </w:rPr>
+        <w:t xml:space="preserve"> 5-10 entry gần nhất. Không có bước nào gợi ý "skill/command nào liên quan" dựa trên module CODE-GRAPH của task hiện tại.</w:t>
+      </w:r>
+    </w:p>
+    <w:p>
+      <w:pPr>
+        <w:spacing w:after="80"/>
+      </w:pPr>
+      <w:r>
+        <w:rPr>
+          <w:b/>
+          <w:sz w:val="21"/>
+        </w:rPr>
+        <w:t>Thay đổi cần làm:</w:t>
+      </w:r>
+    </w:p>
+    <w:p>
+      <w:pPr>
+        <w:spacing w:after="20"/>
+        <w:ind w:left="567" w:hanging="283"/>
+      </w:pPr>
+      <w:r>
+        <w:rPr>
+          <w:sz w:val="21"/>
+        </w:rPr>
+        <w:t>1.</w:t>
+        <w:tab/>
+      </w:r>
+      <w:r>
+        <w:rPr>
+          <w:sz w:val="21"/>
+        </w:rPr>
+        <w:t>task-planner.md: sau Pre-0b, thêm bước lightweight:</w:t>
+      </w:r>
+    </w:p>
+    <w:p>
+      <w:pPr>
+        <w:pStyle w:val="ListBullet"/>
+        <w:spacing w:after="20"/>
+        <w:ind w:left="567"/>
+      </w:pPr>
+      <w:r>
+        <w:rPr>
+          <w:sz w:val="21"/>
+        </w:rPr>
+        <w:t>Đọc CODE-GRAPH.md bảng Module chính</w:t>
+      </w:r>
+    </w:p>
+    <w:p>
+      <w:pPr>
+        <w:pStyle w:val="ListBullet"/>
+        <w:spacing w:after="20"/>
+        <w:ind w:left="567"/>
+      </w:pPr>
+      <w:r>
+        <w:rPr>
+          <w:sz w:val="21"/>
+        </w:rPr>
+        <w:t>So sánh tên task slug với tên/mục đích module (string match đơn giản)</w:t>
+      </w:r>
+    </w:p>
+    <w:p>
+      <w:pPr>
+        <w:pStyle w:val="ListBullet"/>
+        <w:spacing w:after="20"/>
+        <w:ind w:left="567"/>
+      </w:pPr>
+      <w:r>
+        <w:rPr>
+          <w:sz w:val="21"/>
+        </w:rPr>
+        <w:t xml:space="preserve">Tìm trong </w:t>
+      </w:r>
+      <w:r>
+        <w:rPr>
+          <w:rFonts w:ascii="Courier New" w:hAnsi="Courier New"/>
+          <w:color w:val="F05922"/>
+          <w:sz w:val="21"/>
+        </w:rPr>
+        <w:t>.claude/commands/</w:t>
+      </w:r>
+      <w:r>
+        <w:rPr>
+          <w:sz w:val="21"/>
+        </w:rPr>
+        <w:t xml:space="preserve"> các skill liên quan (Glob + đọc </w:t>
+      </w:r>
+      <w:r>
+        <w:rPr>
+          <w:rFonts w:ascii="Courier New" w:hAnsi="Courier New"/>
+          <w:color w:val="F05922"/>
+          <w:sz w:val="21"/>
+        </w:rPr>
+        <w:t>description</w:t>
+      </w:r>
+      <w:r>
+        <w:rPr>
+          <w:sz w:val="21"/>
+        </w:rPr>
+        <w:t xml:space="preserve"> frontmatter)</w:t>
+      </w:r>
+    </w:p>
+    <w:p>
+      <w:pPr>
+        <w:pStyle w:val="ListBullet"/>
+        <w:spacing w:after="20"/>
+        <w:ind w:left="567"/>
+      </w:pPr>
+      <w:r>
+        <w:rPr>
+          <w:sz w:val="21"/>
+        </w:rPr>
+        <w:t xml:space="preserve">Ghi </w:t>
+      </w:r>
+      <w:r>
+        <w:rPr>
+          <w:rFonts w:ascii="Courier New" w:hAnsi="Courier New"/>
+          <w:color w:val="F05922"/>
+          <w:sz w:val="21"/>
+        </w:rPr>
+        <w:t>_workspace/CONTEXT-HINTS.md</w:t>
+      </w:r>
+      <w:r>
+        <w:rPr>
+          <w:sz w:val="21"/>
+        </w:rPr>
+        <w:t xml:space="preserve"> (≤ 20 dòng): module liên quan, skill nên biết, UNCERTAIN entries cần watch</w:t>
+      </w:r>
+    </w:p>
+    <w:p>
+      <w:pPr>
+        <w:spacing w:after="20"/>
+        <w:ind w:left="567" w:hanging="283"/>
+      </w:pPr>
+      <w:r>
+        <w:rPr>
+          <w:sz w:val="21"/>
+        </w:rPr>
+        <w:t>2.</w:t>
+        <w:tab/>
+      </w:r>
+      <w:r>
+        <w:rPr>
+          <w:sz w:val="21"/>
+        </w:rPr>
+        <w:t xml:space="preserve">Dispatcher nhúng nội dung </w:t>
+      </w:r>
+      <w:r>
+        <w:rPr>
+          <w:rFonts w:ascii="Courier New" w:hAnsi="Courier New"/>
+          <w:color w:val="F05922"/>
+          <w:sz w:val="21"/>
+        </w:rPr>
+        <w:t>CONTEXT-HINTS.md</w:t>
+      </w:r>
+      <w:r>
+        <w:rPr>
+          <w:sz w:val="21"/>
+        </w:rPr>
+        <w:t xml:space="preserve"> vào đầu prompt của agent đầu tiên trong chain.</w:t>
+      </w:r>
+    </w:p>
+    <w:p>
+      <w:pPr>
+        <w:spacing w:after="80"/>
+      </w:pPr>
+      <w:r>
+        <w:rPr>
+          <w:b/>
+          <w:sz w:val="21"/>
+        </w:rPr>
+        <w:t>Kết quả đạt được:</w:t>
+      </w:r>
+      <w:r>
+        <w:rPr>
+          <w:sz w:val="21"/>
+        </w:rPr>
+        <w:t xml:space="preserve"> Agent đầu tiên trong chain nhận ngay "module liên quan: X, Y; skill nên dùng: /detect-impact; UNCERTAIN: Z" thay vì phải đọc toàn bộ CODE-GRAPH rồi suy luận — giảm 2-4 tool calls overhead mỗi session mới, đặc biệt quan trọng khi product codebase KZTEK phát triển lớn hơn.</w:t>
+      </w:r>
+    </w:p>
+    <w:p>
+      <w:pPr>
+        <w:pBdr>
+          <w:bottom w:val="single" w:sz="6" w:space="1" w:color="F05922"/>
+        </w:pBdr>
+        <w:spacing w:after="120"/>
+      </w:pPr>
+    </w:p>
+    <w:p>
+      <w:pPr>
+        <w:pStyle w:val="Heading4"/>
+      </w:pPr>
+      <w:r>
+        <w:rPr>
+          <w:color w:val="251C53"/>
+          <w:sz w:val="22"/>
+        </w:rPr>
+        <w:t>GX-6: Structured Handoff Payload keys</w:t>
+      </w:r>
+    </w:p>
+    <w:p>
+      <w:pPr>
+        <w:spacing w:after="80"/>
+      </w:pPr>
+      <w:r>
+        <w:rPr>
+          <w:b/>
+          <w:sz w:val="21"/>
+        </w:rPr>
+        <w:t>Học từ:</w:t>
+      </w:r>
+      <w:r>
+        <w:rPr>
+          <w:sz w:val="21"/>
+        </w:rPr>
+        <w:t xml:space="preserve"> PipelineContext readonly dep isolation trong GitNexus — mỗi phase chỉ thấy </w:t>
+      </w:r>
+      <w:r>
+        <w:rPr>
+          <w:rFonts w:ascii="Courier New" w:hAnsi="Courier New"/>
+          <w:color w:val="F05922"/>
+          <w:sz w:val="18"/>
+        </w:rPr>
+        <w:t>ReadonlyMap&lt;string, PhaseResult&gt;</w:t>
+      </w:r>
+      <w:r>
+        <w:rPr>
+          <w:sz w:val="21"/>
+        </w:rPr>
+        <w:t xml:space="preserve"> của các dep đã khai báo, runner filter trước khi truyền → ngăn hidden coupling. File tham chiếu: </w:t>
+      </w:r>
+      <w:r>
+        <w:rPr>
+          <w:rFonts w:ascii="Courier New" w:hAnsi="Courier New"/>
+          <w:color w:val="F05922"/>
+          <w:sz w:val="18"/>
+        </w:rPr>
+        <w:t>gitnexus/src/core/ingestion/pipeline-phases/runner.ts</w:t>
+      </w:r>
+      <w:r>
+        <w:rPr>
+          <w:sz w:val="21"/>
+        </w:rPr>
+        <w:t xml:space="preserve"> (context building logic).</w:t>
+      </w:r>
+    </w:p>
+    <w:p>
+      <w:pPr>
+        <w:spacing w:after="80"/>
+      </w:pPr>
+      <w:r>
+        <w:rPr>
+          <w:b/>
+          <w:sz w:val="21"/>
+        </w:rPr>
+        <w:t>Hiện trạng KZTEK:</w:t>
+      </w:r>
+      <w:r>
+        <w:rPr>
+          <w:sz w:val="21"/>
+        </w:rPr>
+        <w:t xml:space="preserve"> §16.4 Handoff Log là free-text với 4 dấu gạch đầu dòng gợi ý:</w:t>
+      </w:r>
+    </w:p>
+    <w:p>
+      <w:pPr>
+        <w:spacing w:before="80" w:after="80"/>
+        <w:ind w:left="283"/>
+        <w:shd w:val="clear" w:color="auto" w:fill="F4F4F8"/>
+      </w:pPr>
+      <w:r>
+        <w:rPr>
+          <w:rFonts w:ascii="Courier New" w:hAnsi="Courier New"/>
+          <w:color w:val="251C53"/>
+          <w:sz w:val="18"/>
+        </w:rPr>
+        <w:t>- Đã làm: [tóm tắt 2-3 câu]</w:t>
+        <w:br/>
+        <w:t>- File/module đã đọc hoặc đổi: [đường dẫn]</w:t>
+        <w:br/>
+        <w:t>- Quyết định quan trọng: [nếu có]</w:t>
+        <w:br/>
+        <w:t>- Bước sau cần biết: [cảnh báo / gotcha / điều KHÔNG cần làm lại]</w:t>
+      </w:r>
+    </w:p>
+    <w:p>
+      <w:pPr>
+        <w:spacing w:after="80"/>
+      </w:pPr>
+      <w:r>
+        <w:rPr>
+          <w:sz w:val="21"/>
+        </w:rPr>
+        <w:t>Dispatcher truyền "nguyên văn nội dung" — agent kế tiếp phải đọc toàn bộ 4 mục, trong đó "Đã làm" và "File đã đọc" thường dài và không cần thiết cho bước kế tiếp.</w:t>
+      </w:r>
+    </w:p>
+    <w:p>
+      <w:pPr>
+        <w:spacing w:after="80"/>
+      </w:pPr>
+      <w:r>
+        <w:rPr>
+          <w:b/>
+          <w:sz w:val="21"/>
+        </w:rPr>
+        <w:t>Thay đổi cần làm:</w:t>
+      </w:r>
+    </w:p>
+    <w:p>
+      <w:pPr>
+        <w:spacing w:after="20"/>
+        <w:ind w:left="567" w:hanging="283"/>
+      </w:pPr>
+      <w:r>
+        <w:rPr>
+          <w:sz w:val="21"/>
+        </w:rPr>
+        <w:t>1.</w:t>
+        <w:tab/>
+      </w:r>
+      <w:r>
+        <w:rPr>
+          <w:sz w:val="21"/>
+        </w:rPr>
+        <w:t>PLAN-STEP-template.md: chia Handoff Log thành section rõ:</w:t>
+      </w:r>
+    </w:p>
+    <w:p>
+      <w:pPr>
+        <w:spacing w:before="80" w:after="80"/>
+        <w:ind w:left="283"/>
+        <w:shd w:val="clear" w:color="auto" w:fill="F4F4F8"/>
+      </w:pPr>
+      <w:r>
+        <w:rPr>
+          <w:rFonts w:ascii="Courier New" w:hAnsi="Courier New"/>
+          <w:color w:val="251C53"/>
+          <w:sz w:val="18"/>
+        </w:rPr>
+        <w:t>## Handoff Payload — bước sau đọc phần này (chỉ phần này, không cần đọc "Đã làm")</w:t>
+        <w:br/>
+        <w:t>- do_not_redo: [thao tác đã làm xong, bước sau KHÔNG làm lại — vd: "đã clone, không cần clone lại"]</w:t>
+        <w:br/>
+        <w:t>- watch_out: [gotcha / điều kiện bất ngờ bước sau cần biết — vd: "branch X đang ở dirty state"]</w:t>
+        <w:br/>
+        <w:t>- next_inputs: [artifact/file/quyết định bước sau cần làm input — vd: "dùng commit hash abc1234"]</w:t>
+      </w:r>
+    </w:p>
+    <w:p>
+      <w:pPr>
+        <w:spacing w:after="20"/>
+        <w:ind w:left="567" w:hanging="283"/>
+      </w:pPr>
+      <w:r>
+        <w:rPr>
+          <w:sz w:val="21"/>
+        </w:rPr>
+        <w:t>2.</w:t>
+        <w:tab/>
+      </w:r>
+      <w:r>
+        <w:rPr>
+          <w:sz w:val="21"/>
+        </w:rPr>
+        <w:t>§16.4 CLAUDE.md: hướng dẫn Dispatcher chỉ trích 3 key trên để nhúng vào prompt kế tiếp — không truyền section "Đã làm" trừ khi bước kế tiếp đặc biệt cần biết chi tiết.</w:t>
+      </w:r>
+    </w:p>
+    <w:p>
+      <w:pPr>
+        <w:spacing w:after="80"/>
+      </w:pPr>
+      <w:r>
+        <w:rPr>
+          <w:b/>
+          <w:sz w:val="21"/>
+        </w:rPr>
+        <w:t>Kết quả đạt được:</w:t>
+      </w:r>
+      <w:r>
+        <w:rPr>
+          <w:sz w:val="21"/>
+        </w:rPr>
+        <w:t xml:space="preserve"> Prompt của agent kế tiếp giảm ~40-60% noise (bỏ phần "Đã làm" dài); 3 key rõ ràng dễ đọc hơn đoạn văn tự do → giảm trường hợp agent bỏ qua Handoff Log vì "quá dài, không biết phần nào quan trọng."</w:t>
       </w:r>
     </w:p>
     <w:sectPr>

</xml_diff>